<commit_message>
School guide: use MS Mincho 10.5pt and default line spacing
Co-Authored-By: Claude Opus 5.5 <noreply@anthropic.com>
Claude-Session: https://claude.ai/code/session_01AYFVAJYvgnVnubWxFoYjw7
</commit_message>
<xml_diff>
--- a/docs/私立高校比較ガイド_神戸学院_武庫川_親和_龍谷.docx
+++ b/docs/私立高校比較ガイド_神戸学院_武庫川_親和_龍谷.docx
@@ -12,8 +12,8 @@
           <w:b/>
           <w:bCs/>
           <w:color w:val="1F4E79"/>
-          <w:sz w:val="36"/>
-          <w:szCs w:val="36"/>
+          <w:sz w:val="21"/>
+          <w:szCs w:val="21"/>
         </w:rPr>
         <w:t xml:space="preserve">私立高校 比較ガイド</w:t>
       </w:r>
@@ -27,34 +27,34 @@
         <w:rPr>
           <w:b/>
           <w:bCs/>
-          <w:sz w:val="22"/>
-          <w:szCs w:val="22"/>
+          <w:sz w:val="21"/>
+          <w:szCs w:val="21"/>
         </w:rPr>
         <w:t xml:space="preserve">神戸学院大学附属／武庫川女子大学附属／親和女子／神戸龍谷</w:t>
       </w:r>
     </w:p>
     <w:p>
       <w:pPr>
-        <w:spacing w:after="80" w:line="300"/>
+        <w:spacing w:after="80"/>
       </w:pPr>
       <w:r>
         <w:rPr>
           <w:b/>
           <w:bCs/>
-          <w:sz w:val="20"/>
-          <w:szCs w:val="20"/>
+          <w:sz w:val="21"/>
+          <w:szCs w:val="21"/>
         </w:rPr>
         <w:t xml:space="preserve">生徒・保護者の皆さまへ</w:t>
       </w:r>
     </w:p>
     <w:p>
       <w:pPr>
-        <w:spacing w:after="80" w:line="300"/>
+        <w:spacing w:after="80"/>
       </w:pPr>
       <w:r>
         <w:rPr>
-          <w:sz w:val="20"/>
-          <w:szCs w:val="20"/>
+          <w:sz w:val="21"/>
+          <w:szCs w:val="21"/>
         </w:rPr>
         <w:t xml:space="preserve">志望校を検討中の皆さまに、各校の「場所（最寄り駅）」「コース」「校風」「特筆すべき学校行事」などを一覧にまとめました。学校選びの第一歩としてご活用ください。最終的な判断の前には、必ず各校の説明会・オープンスクールに参加し、最新の募集要項をご確認ください。</w:t>
       </w:r>
@@ -114,15 +114,15 @@
           </w:tcPr>
           <w:p>
             <w:pPr>
-              <w:spacing w:after="20" w:line="260"/>
+              <w:spacing w:after="20"/>
             </w:pPr>
             <w:r>
               <w:rPr>
                 <w:b/>
                 <w:bCs/>
                 <w:color w:val="FFFFFF"/>
-                <w:sz w:val="17"/>
-                <w:szCs w:val="17"/>
+                <w:sz w:val="21"/>
+                <w:szCs w:val="21"/>
               </w:rPr>
               <w:t xml:space="preserve"/>
             </w:r>
@@ -147,15 +147,15 @@
           </w:tcPr>
           <w:p>
             <w:pPr>
-              <w:spacing w:after="20" w:line="260"/>
+              <w:spacing w:after="20"/>
             </w:pPr>
             <w:r>
               <w:rPr>
                 <w:b/>
                 <w:bCs/>
                 <w:color w:val="FFFFFF"/>
-                <w:sz w:val="17"/>
-                <w:szCs w:val="17"/>
+                <w:sz w:val="21"/>
+                <w:szCs w:val="21"/>
               </w:rPr>
               <w:t xml:space="preserve">神戸学院附属</w:t>
             </w:r>
@@ -180,15 +180,15 @@
           </w:tcPr>
           <w:p>
             <w:pPr>
-              <w:spacing w:after="20" w:line="260"/>
+              <w:spacing w:after="20"/>
             </w:pPr>
             <w:r>
               <w:rPr>
                 <w:b/>
                 <w:bCs/>
                 <w:color w:val="FFFFFF"/>
-                <w:sz w:val="17"/>
-                <w:szCs w:val="17"/>
+                <w:sz w:val="21"/>
+                <w:szCs w:val="21"/>
               </w:rPr>
               <w:t xml:space="preserve">武庫川女子附属</w:t>
             </w:r>
@@ -213,15 +213,15 @@
           </w:tcPr>
           <w:p>
             <w:pPr>
-              <w:spacing w:after="20" w:line="260"/>
+              <w:spacing w:after="20"/>
             </w:pPr>
             <w:r>
               <w:rPr>
                 <w:b/>
                 <w:bCs/>
                 <w:color w:val="FFFFFF"/>
-                <w:sz w:val="17"/>
-                <w:szCs w:val="17"/>
+                <w:sz w:val="21"/>
+                <w:szCs w:val="21"/>
               </w:rPr>
               <w:t xml:space="preserve">親和女子</w:t>
             </w:r>
@@ -246,15 +246,15 @@
           </w:tcPr>
           <w:p>
             <w:pPr>
-              <w:spacing w:after="20" w:line="260"/>
+              <w:spacing w:after="20"/>
             </w:pPr>
             <w:r>
               <w:rPr>
                 <w:b/>
                 <w:bCs/>
                 <w:color w:val="FFFFFF"/>
-                <w:sz w:val="17"/>
-                <w:szCs w:val="17"/>
+                <w:sz w:val="21"/>
+                <w:szCs w:val="21"/>
               </w:rPr>
               <w:t xml:space="preserve">神戸龍谷</w:t>
             </w:r>
@@ -284,14 +284,14 @@
           </w:tcPr>
           <w:p>
             <w:pPr>
-              <w:spacing w:after="20" w:line="260"/>
-            </w:pPr>
-            <w:r>
-              <w:rPr>
-                <w:b w:val="false"/>
-                <w:bCs w:val="false"/>
-                <w:sz w:val="17"/>
-                <w:szCs w:val="17"/>
+              <w:spacing w:after="20"/>
+            </w:pPr>
+            <w:r>
+              <w:rPr>
+                <w:b w:val="false"/>
+                <w:bCs w:val="false"/>
+                <w:sz w:val="21"/>
+                <w:szCs w:val="21"/>
               </w:rPr>
               <w:t xml:space="preserve">男女</w:t>
             </w:r>
@@ -315,14 +315,14 @@
           </w:tcPr>
           <w:p>
             <w:pPr>
-              <w:spacing w:after="20" w:line="260"/>
-            </w:pPr>
-            <w:r>
-              <w:rPr>
-                <w:b w:val="false"/>
-                <w:bCs w:val="false"/>
-                <w:sz w:val="17"/>
-                <w:szCs w:val="17"/>
+              <w:spacing w:after="20"/>
+            </w:pPr>
+            <w:r>
+              <w:rPr>
+                <w:b w:val="false"/>
+                <w:bCs w:val="false"/>
+                <w:sz w:val="21"/>
+                <w:szCs w:val="21"/>
               </w:rPr>
               <w:t xml:space="preserve">共学</w:t>
             </w:r>
@@ -346,14 +346,14 @@
           </w:tcPr>
           <w:p>
             <w:pPr>
-              <w:spacing w:after="20" w:line="260"/>
-            </w:pPr>
-            <w:r>
-              <w:rPr>
-                <w:b w:val="false"/>
-                <w:bCs w:val="false"/>
-                <w:sz w:val="17"/>
-                <w:szCs w:val="17"/>
+              <w:spacing w:after="20"/>
+            </w:pPr>
+            <w:r>
+              <w:rPr>
+                <w:b w:val="false"/>
+                <w:bCs w:val="false"/>
+                <w:sz w:val="21"/>
+                <w:szCs w:val="21"/>
               </w:rPr>
               <w:t xml:space="preserve">女子校</w:t>
             </w:r>
@@ -377,14 +377,14 @@
           </w:tcPr>
           <w:p>
             <w:pPr>
-              <w:spacing w:after="20" w:line="260"/>
-            </w:pPr>
-            <w:r>
-              <w:rPr>
-                <w:b w:val="false"/>
-                <w:bCs w:val="false"/>
-                <w:sz w:val="17"/>
-                <w:szCs w:val="17"/>
+              <w:spacing w:after="20"/>
+            </w:pPr>
+            <w:r>
+              <w:rPr>
+                <w:b w:val="false"/>
+                <w:bCs w:val="false"/>
+                <w:sz w:val="21"/>
+                <w:szCs w:val="21"/>
               </w:rPr>
               <w:t xml:space="preserve">女子校</w:t>
             </w:r>
@@ -408,14 +408,14 @@
           </w:tcPr>
           <w:p>
             <w:pPr>
-              <w:spacing w:after="20" w:line="260"/>
-            </w:pPr>
-            <w:r>
-              <w:rPr>
-                <w:b w:val="false"/>
-                <w:bCs w:val="false"/>
-                <w:sz w:val="17"/>
-                <w:szCs w:val="17"/>
+              <w:spacing w:after="20"/>
+            </w:pPr>
+            <w:r>
+              <w:rPr>
+                <w:b w:val="false"/>
+                <w:bCs w:val="false"/>
+                <w:sz w:val="21"/>
+                <w:szCs w:val="21"/>
               </w:rPr>
               <w:t xml:space="preserve">共学</w:t>
             </w:r>
@@ -445,14 +445,14 @@
           </w:tcPr>
           <w:p>
             <w:pPr>
-              <w:spacing w:after="20" w:line="260"/>
-            </w:pPr>
-            <w:r>
-              <w:rPr>
-                <w:b w:val="false"/>
-                <w:bCs w:val="false"/>
-                <w:sz w:val="17"/>
-                <w:szCs w:val="17"/>
+              <w:spacing w:after="20"/>
+            </w:pPr>
+            <w:r>
+              <w:rPr>
+                <w:b w:val="false"/>
+                <w:bCs w:val="false"/>
+                <w:sz w:val="21"/>
+                <w:szCs w:val="21"/>
               </w:rPr>
               <w:t xml:space="preserve">最寄り駅</w:t>
             </w:r>
@@ -476,14 +476,14 @@
           </w:tcPr>
           <w:p>
             <w:pPr>
-              <w:spacing w:after="20" w:line="260"/>
-            </w:pPr>
-            <w:r>
-              <w:rPr>
-                <w:b w:val="false"/>
-                <w:bCs w:val="false"/>
-                <w:sz w:val="17"/>
-                <w:szCs w:val="17"/>
+              <w:spacing w:after="20"/>
+            </w:pPr>
+            <w:r>
+              <w:rPr>
+                <w:b w:val="false"/>
+                <w:bCs w:val="false"/>
+                <w:sz w:val="21"/>
+                <w:szCs w:val="21"/>
               </w:rPr>
               <w:t xml:space="preserve">ポートライナー みなとじま 徒歩1分</w:t>
             </w:r>
@@ -507,14 +507,14 @@
           </w:tcPr>
           <w:p>
             <w:pPr>
-              <w:spacing w:after="20" w:line="260"/>
-            </w:pPr>
-            <w:r>
-              <w:rPr>
-                <w:b w:val="false"/>
-                <w:bCs w:val="false"/>
-                <w:sz w:val="17"/>
-                <w:szCs w:val="17"/>
+              <w:spacing w:after="20"/>
+            </w:pPr>
+            <w:r>
+              <w:rPr>
+                <w:b w:val="false"/>
+                <w:bCs w:val="false"/>
+                <w:sz w:val="21"/>
+                <w:szCs w:val="21"/>
               </w:rPr>
               <w:t xml:space="preserve">阪神 鳴尾・武庫川女子大前 徒歩約15分／甲子園からバス</w:t>
             </w:r>
@@ -538,14 +538,14 @@
           </w:tcPr>
           <w:p>
             <w:pPr>
-              <w:spacing w:after="20" w:line="260"/>
-            </w:pPr>
-            <w:r>
-              <w:rPr>
-                <w:b w:val="false"/>
-                <w:bCs w:val="false"/>
-                <w:sz w:val="17"/>
-                <w:szCs w:val="17"/>
+              <w:spacing w:after="20"/>
+            </w:pPr>
+            <w:r>
+              <w:rPr>
+                <w:b w:val="false"/>
+                <w:bCs w:val="false"/>
+                <w:sz w:val="21"/>
+                <w:szCs w:val="21"/>
               </w:rPr>
               <w:t xml:space="preserve">阪急 六甲 徒歩約15分</w:t>
             </w:r>
@@ -569,14 +569,14 @@
           </w:tcPr>
           <w:p>
             <w:pPr>
-              <w:spacing w:after="20" w:line="260"/>
-            </w:pPr>
-            <w:r>
-              <w:rPr>
-                <w:b w:val="false"/>
-                <w:bCs w:val="false"/>
-                <w:sz w:val="17"/>
-                <w:szCs w:val="17"/>
+              <w:spacing w:after="20"/>
+            </w:pPr>
+            <w:r>
+              <w:rPr>
+                <w:b w:val="false"/>
+                <w:bCs w:val="false"/>
+                <w:sz w:val="21"/>
+                <w:szCs w:val="21"/>
               </w:rPr>
               <w:t xml:space="preserve">地下鉄 新神戸 徒歩約15分／青谷バス停 徒歩5分</w:t>
             </w:r>
@@ -606,14 +606,14 @@
           </w:tcPr>
           <w:p>
             <w:pPr>
-              <w:spacing w:after="20" w:line="260"/>
-            </w:pPr>
-            <w:r>
-              <w:rPr>
-                <w:b w:val="false"/>
-                <w:bCs w:val="false"/>
-                <w:sz w:val="17"/>
-                <w:szCs w:val="17"/>
+              <w:spacing w:after="20"/>
+            </w:pPr>
+            <w:r>
+              <w:rPr>
+                <w:b w:val="false"/>
+                <w:bCs w:val="false"/>
+                <w:sz w:val="21"/>
+                <w:szCs w:val="21"/>
               </w:rPr>
               <w:t xml:space="preserve">通学のしやすさ</w:t>
             </w:r>
@@ -637,14 +637,14 @@
           </w:tcPr>
           <w:p>
             <w:pPr>
-              <w:spacing w:after="20" w:line="260"/>
-            </w:pPr>
-            <w:r>
-              <w:rPr>
-                <w:b w:val="false"/>
-                <w:bCs w:val="false"/>
-                <w:sz w:val="17"/>
-                <w:szCs w:val="17"/>
+              <w:spacing w:after="20"/>
+            </w:pPr>
+            <w:r>
+              <w:rPr>
+                <w:b w:val="false"/>
+                <w:bCs w:val="false"/>
+                <w:sz w:val="21"/>
+                <w:szCs w:val="21"/>
               </w:rPr>
               <w:t xml:space="preserve">◎ 駅すぐ</w:t>
             </w:r>
@@ -668,14 +668,14 @@
           </w:tcPr>
           <w:p>
             <w:pPr>
-              <w:spacing w:after="20" w:line="260"/>
-            </w:pPr>
-            <w:r>
-              <w:rPr>
-                <w:b w:val="false"/>
-                <w:bCs w:val="false"/>
-                <w:sz w:val="17"/>
-                <w:szCs w:val="17"/>
+              <w:spacing w:after="20"/>
+            </w:pPr>
+            <w:r>
+              <w:rPr>
+                <w:b w:val="false"/>
+                <w:bCs w:val="false"/>
+                <w:sz w:val="21"/>
+                <w:szCs w:val="21"/>
               </w:rPr>
               <w:t xml:space="preserve">○ 阪神・西宮方面向き</w:t>
             </w:r>
@@ -699,14 +699,14 @@
           </w:tcPr>
           <w:p>
             <w:pPr>
-              <w:spacing w:after="20" w:line="260"/>
-            </w:pPr>
-            <w:r>
-              <w:rPr>
-                <w:b w:val="false"/>
-                <w:bCs w:val="false"/>
-                <w:sz w:val="17"/>
-                <w:szCs w:val="17"/>
+              <w:spacing w:after="20"/>
+            </w:pPr>
+            <w:r>
+              <w:rPr>
+                <w:b w:val="false"/>
+                <w:bCs w:val="false"/>
+                <w:sz w:val="21"/>
+                <w:szCs w:val="21"/>
               </w:rPr>
               <w:t xml:space="preserve">△ 坂道</w:t>
             </w:r>
@@ -730,14 +730,14 @@
           </w:tcPr>
           <w:p>
             <w:pPr>
-              <w:spacing w:after="20" w:line="260"/>
-            </w:pPr>
-            <w:r>
-              <w:rPr>
-                <w:b w:val="false"/>
-                <w:bCs w:val="false"/>
-                <w:sz w:val="17"/>
-                <w:szCs w:val="17"/>
+              <w:spacing w:after="20"/>
+            </w:pPr>
+            <w:r>
+              <w:rPr>
+                <w:b w:val="false"/>
+                <w:bCs w:val="false"/>
+                <w:sz w:val="21"/>
+                <w:szCs w:val="21"/>
               </w:rPr>
               <w:t xml:space="preserve">△ バス併用が便利</w:t>
             </w:r>
@@ -767,14 +767,14 @@
           </w:tcPr>
           <w:p>
             <w:pPr>
-              <w:spacing w:after="20" w:line="260"/>
-            </w:pPr>
-            <w:r>
-              <w:rPr>
-                <w:b w:val="false"/>
-                <w:bCs w:val="false"/>
-                <w:sz w:val="17"/>
-                <w:szCs w:val="17"/>
+              <w:spacing w:after="20"/>
+            </w:pPr>
+            <w:r>
+              <w:rPr>
+                <w:b w:val="false"/>
+                <w:bCs w:val="false"/>
+                <w:sz w:val="21"/>
+                <w:szCs w:val="21"/>
               </w:rPr>
               <w:t xml:space="preserve">特進系コース</w:t>
             </w:r>
@@ -798,14 +798,14 @@
           </w:tcPr>
           <w:p>
             <w:pPr>
-              <w:spacing w:after="20" w:line="260"/>
-            </w:pPr>
-            <w:r>
-              <w:rPr>
-                <w:b w:val="false"/>
-                <w:bCs w:val="false"/>
-                <w:sz w:val="17"/>
-                <w:szCs w:val="17"/>
+              <w:spacing w:after="20"/>
+            </w:pPr>
+            <w:r>
+              <w:rPr>
+                <w:b w:val="false"/>
+                <w:bCs w:val="false"/>
+                <w:sz w:val="21"/>
+                <w:szCs w:val="21"/>
               </w:rPr>
               <w:t xml:space="preserve">特進文理／特進グローバル</w:t>
             </w:r>
@@ -829,14 +829,14 @@
           </w:tcPr>
           <w:p>
             <w:pPr>
-              <w:spacing w:after="20" w:line="260"/>
-            </w:pPr>
-            <w:r>
-              <w:rPr>
-                <w:b w:val="false"/>
-                <w:bCs w:val="false"/>
-                <w:sz w:val="17"/>
-                <w:szCs w:val="17"/>
+              <w:spacing w:after="20"/>
+            </w:pPr>
+            <w:r>
+              <w:rPr>
+                <w:b w:val="false"/>
+                <w:bCs w:val="false"/>
+                <w:sz w:val="21"/>
+                <w:szCs w:val="21"/>
               </w:rPr>
               <w:t xml:space="preserve">SOARグローバルサイエンス</w:t>
             </w:r>
@@ -860,14 +860,14 @@
           </w:tcPr>
           <w:p>
             <w:pPr>
-              <w:spacing w:after="20" w:line="260"/>
-            </w:pPr>
-            <w:r>
-              <w:rPr>
-                <w:b w:val="false"/>
-                <w:bCs w:val="false"/>
-                <w:sz w:val="17"/>
-                <w:szCs w:val="17"/>
+              <w:spacing w:after="20"/>
+            </w:pPr>
+            <w:r>
+              <w:rPr>
+                <w:b w:val="false"/>
+                <w:bCs w:val="false"/>
+                <w:sz w:val="21"/>
+                <w:szCs w:val="21"/>
               </w:rPr>
               <w:t xml:space="preserve">アドバンスト</w:t>
             </w:r>
@@ -891,14 +891,14 @@
           </w:tcPr>
           <w:p>
             <w:pPr>
-              <w:spacing w:after="20" w:line="260"/>
-            </w:pPr>
-            <w:r>
-              <w:rPr>
-                <w:b w:val="false"/>
-                <w:bCs w:val="false"/>
-                <w:sz w:val="17"/>
-                <w:szCs w:val="17"/>
+              <w:spacing w:after="20"/>
+            </w:pPr>
+            <w:r>
+              <w:rPr>
+                <w:b w:val="false"/>
+                <w:bCs w:val="false"/>
+                <w:sz w:val="21"/>
+                <w:szCs w:val="21"/>
               </w:rPr>
               <w:t xml:space="preserve">医療理数／難関進学／国際教養</w:t>
             </w:r>
@@ -928,14 +928,14 @@
           </w:tcPr>
           <w:p>
             <w:pPr>
-              <w:spacing w:after="20" w:line="260"/>
-            </w:pPr>
-            <w:r>
-              <w:rPr>
-                <w:b w:val="false"/>
-                <w:bCs w:val="false"/>
-                <w:sz w:val="17"/>
-                <w:szCs w:val="17"/>
+              <w:spacing w:after="20"/>
+            </w:pPr>
+            <w:r>
+              <w:rPr>
+                <w:b w:val="false"/>
+                <w:bCs w:val="false"/>
+                <w:sz w:val="21"/>
+                <w:szCs w:val="21"/>
               </w:rPr>
               <w:t xml:space="preserve">併設大学</w:t>
             </w:r>
@@ -959,14 +959,14 @@
           </w:tcPr>
           <w:p>
             <w:pPr>
-              <w:spacing w:after="20" w:line="260"/>
-            </w:pPr>
-            <w:r>
-              <w:rPr>
-                <w:b w:val="false"/>
-                <w:bCs w:val="false"/>
-                <w:sz w:val="17"/>
-                <w:szCs w:val="17"/>
+              <w:spacing w:after="20"/>
+            </w:pPr>
+            <w:r>
+              <w:rPr>
+                <w:b w:val="false"/>
+                <w:bCs w:val="false"/>
+                <w:sz w:val="21"/>
+                <w:szCs w:val="21"/>
               </w:rPr>
               <w:t xml:space="preserve">神戸学院大学（総合大学）</w:t>
             </w:r>
@@ -990,14 +990,14 @@
           </w:tcPr>
           <w:p>
             <w:pPr>
-              <w:spacing w:after="20" w:line="260"/>
-            </w:pPr>
-            <w:r>
-              <w:rPr>
-                <w:b w:val="false"/>
-                <w:bCs w:val="false"/>
-                <w:sz w:val="17"/>
-                <w:szCs w:val="17"/>
+              <w:spacing w:after="20"/>
+            </w:pPr>
+            <w:r>
+              <w:rPr>
+                <w:b w:val="false"/>
+                <w:bCs w:val="false"/>
+                <w:sz w:val="21"/>
+                <w:szCs w:val="21"/>
               </w:rPr>
               <w:t xml:space="preserve">武庫川女子大学（2027〜武庫川大学）</w:t>
             </w:r>
@@ -1021,14 +1021,14 @@
           </w:tcPr>
           <w:p>
             <w:pPr>
-              <w:spacing w:after="20" w:line="260"/>
-            </w:pPr>
-            <w:r>
-              <w:rPr>
-                <w:b w:val="false"/>
-                <w:bCs w:val="false"/>
-                <w:sz w:val="17"/>
-                <w:szCs w:val="17"/>
+              <w:spacing w:after="20"/>
+            </w:pPr>
+            <w:r>
+              <w:rPr>
+                <w:b w:val="false"/>
+                <w:bCs w:val="false"/>
+                <w:sz w:val="21"/>
+                <w:szCs w:val="21"/>
               </w:rPr>
               <w:t xml:space="preserve">神戸親和大学（教育系に強い）</w:t>
             </w:r>
@@ -1052,14 +1052,14 @@
           </w:tcPr>
           <w:p>
             <w:pPr>
-              <w:spacing w:after="20" w:line="260"/>
-            </w:pPr>
-            <w:r>
-              <w:rPr>
-                <w:b w:val="false"/>
-                <w:bCs w:val="false"/>
-                <w:sz w:val="17"/>
-                <w:szCs w:val="17"/>
+              <w:spacing w:after="20"/>
+            </w:pPr>
+            <w:r>
+              <w:rPr>
+                <w:b w:val="false"/>
+                <w:bCs w:val="false"/>
+                <w:sz w:val="21"/>
+                <w:szCs w:val="21"/>
               </w:rPr>
               <w:t xml:space="preserve">龍谷大学など（関係校）</w:t>
             </w:r>
@@ -1089,14 +1089,14 @@
           </w:tcPr>
           <w:p>
             <w:pPr>
-              <w:spacing w:after="20" w:line="260"/>
-            </w:pPr>
-            <w:r>
-              <w:rPr>
-                <w:b w:val="false"/>
-                <w:bCs w:val="false"/>
-                <w:sz w:val="17"/>
-                <w:szCs w:val="17"/>
+              <w:spacing w:after="20"/>
+            </w:pPr>
+            <w:r>
+              <w:rPr>
+                <w:b w:val="false"/>
+                <w:bCs w:val="false"/>
+                <w:sz w:val="21"/>
+                <w:szCs w:val="21"/>
               </w:rPr>
               <w:t xml:space="preserve">内部進学の比重</w:t>
             </w:r>
@@ -1120,14 +1120,14 @@
           </w:tcPr>
           <w:p>
             <w:pPr>
-              <w:spacing w:after="20" w:line="260"/>
-            </w:pPr>
-            <w:r>
-              <w:rPr>
-                <w:b w:val="false"/>
-                <w:bCs w:val="false"/>
-                <w:sz w:val="17"/>
-                <w:szCs w:val="17"/>
+              <w:spacing w:after="20"/>
+            </w:pPr>
+            <w:r>
+              <w:rPr>
+                <w:b w:val="false"/>
+                <w:bCs w:val="false"/>
+                <w:sz w:val="21"/>
+                <w:szCs w:val="21"/>
               </w:rPr>
               <w:t xml:space="preserve">中（推薦制度あり）</w:t>
             </w:r>
@@ -1151,14 +1151,14 @@
           </w:tcPr>
           <w:p>
             <w:pPr>
-              <w:spacing w:after="20" w:line="260"/>
-            </w:pPr>
-            <w:r>
-              <w:rPr>
-                <w:b w:val="false"/>
-                <w:bCs w:val="false"/>
-                <w:sz w:val="17"/>
-                <w:szCs w:val="17"/>
+              <w:spacing w:after="20"/>
+            </w:pPr>
+            <w:r>
+              <w:rPr>
+                <w:b w:val="false"/>
+                <w:bCs w:val="false"/>
+                <w:sz w:val="21"/>
+                <w:szCs w:val="21"/>
               </w:rPr>
               <w:t xml:space="preserve">高（約8割が内部）</w:t>
             </w:r>
@@ -1182,14 +1182,14 @@
           </w:tcPr>
           <w:p>
             <w:pPr>
-              <w:spacing w:after="20" w:line="260"/>
-            </w:pPr>
-            <w:r>
-              <w:rPr>
-                <w:b w:val="false"/>
-                <w:bCs w:val="false"/>
-                <w:sz w:val="17"/>
-                <w:szCs w:val="17"/>
+              <w:spacing w:after="20"/>
+            </w:pPr>
+            <w:r>
+              <w:rPr>
+                <w:b w:val="false"/>
+                <w:bCs w:val="false"/>
+                <w:sz w:val="21"/>
+                <w:szCs w:val="21"/>
               </w:rPr>
               <w:t xml:space="preserve">中</w:t>
             </w:r>
@@ -1213,14 +1213,14 @@
           </w:tcPr>
           <w:p>
             <w:pPr>
-              <w:spacing w:after="20" w:line="260"/>
-            </w:pPr>
-            <w:r>
-              <w:rPr>
-                <w:b w:val="false"/>
-                <w:bCs w:val="false"/>
-                <w:sz w:val="17"/>
-                <w:szCs w:val="17"/>
+              <w:spacing w:after="20"/>
+            </w:pPr>
+            <w:r>
+              <w:rPr>
+                <w:b w:val="false"/>
+                <w:bCs w:val="false"/>
+                <w:sz w:val="21"/>
+                <w:szCs w:val="21"/>
               </w:rPr>
               <w:t xml:space="preserve">低〜中</w:t>
             </w:r>
@@ -1250,14 +1250,14 @@
           </w:tcPr>
           <w:p>
             <w:pPr>
-              <w:spacing w:after="20" w:line="260"/>
-            </w:pPr>
-            <w:r>
-              <w:rPr>
-                <w:b w:val="false"/>
-                <w:bCs w:val="false"/>
-                <w:sz w:val="17"/>
-                <w:szCs w:val="17"/>
+              <w:spacing w:after="20"/>
+            </w:pPr>
+            <w:r>
+              <w:rPr>
+                <w:b w:val="false"/>
+                <w:bCs w:val="false"/>
+                <w:sz w:val="21"/>
+                <w:szCs w:val="21"/>
               </w:rPr>
               <w:t xml:space="preserve">宗教・伝統</w:t>
             </w:r>
@@ -1281,14 +1281,14 @@
           </w:tcPr>
           <w:p>
             <w:pPr>
-              <w:spacing w:after="20" w:line="260"/>
-            </w:pPr>
-            <w:r>
-              <w:rPr>
-                <w:b w:val="false"/>
-                <w:bCs w:val="false"/>
-                <w:sz w:val="17"/>
-                <w:szCs w:val="17"/>
+              <w:spacing w:after="20"/>
+            </w:pPr>
+            <w:r>
+              <w:rPr>
+                <w:b w:val="false"/>
+                <w:bCs w:val="false"/>
+                <w:sz w:val="21"/>
+                <w:szCs w:val="21"/>
               </w:rPr>
               <w:t xml:space="preserve">特になし</w:t>
             </w:r>
@@ -1312,14 +1312,14 @@
           </w:tcPr>
           <w:p>
             <w:pPr>
-              <w:spacing w:after="20" w:line="260"/>
-            </w:pPr>
-            <w:r>
-              <w:rPr>
-                <w:b w:val="false"/>
-                <w:bCs w:val="false"/>
-                <w:sz w:val="17"/>
-                <w:szCs w:val="17"/>
+              <w:spacing w:after="20"/>
+            </w:pPr>
+            <w:r>
+              <w:rPr>
+                <w:b w:val="false"/>
+                <w:bCs w:val="false"/>
+                <w:sz w:val="21"/>
+                <w:szCs w:val="21"/>
               </w:rPr>
               <w:t xml:space="preserve">特になし</w:t>
             </w:r>
@@ -1343,14 +1343,14 @@
           </w:tcPr>
           <w:p>
             <w:pPr>
-              <w:spacing w:after="20" w:line="260"/>
-            </w:pPr>
-            <w:r>
-              <w:rPr>
-                <w:b w:val="false"/>
-                <w:bCs w:val="false"/>
-                <w:sz w:val="17"/>
-                <w:szCs w:val="17"/>
+              <w:spacing w:after="20"/>
+            </w:pPr>
+            <w:r>
+              <w:rPr>
+                <w:b w:val="false"/>
+                <w:bCs w:val="false"/>
+                <w:sz w:val="21"/>
+                <w:szCs w:val="21"/>
               </w:rPr>
               <w:t xml:space="preserve">伝統校（1887年創立）</w:t>
             </w:r>
@@ -1374,14 +1374,14 @@
           </w:tcPr>
           <w:p>
             <w:pPr>
-              <w:spacing w:after="20" w:line="260"/>
-            </w:pPr>
-            <w:r>
-              <w:rPr>
-                <w:b w:val="false"/>
-                <w:bCs w:val="false"/>
-                <w:sz w:val="17"/>
-                <w:szCs w:val="17"/>
+              <w:spacing w:after="20"/>
+            </w:pPr>
+            <w:r>
+              <w:rPr>
+                <w:b w:val="false"/>
+                <w:bCs w:val="false"/>
+                <w:sz w:val="21"/>
+                <w:szCs w:val="21"/>
               </w:rPr>
               <w:t xml:space="preserve">浄土真宗の宗門校</w:t>
             </w:r>
@@ -1411,14 +1411,14 @@
           </w:tcPr>
           <w:p>
             <w:pPr>
-              <w:spacing w:after="20" w:line="260"/>
-            </w:pPr>
-            <w:r>
-              <w:rPr>
-                <w:b w:val="false"/>
-                <w:bCs w:val="false"/>
-                <w:sz w:val="17"/>
-                <w:szCs w:val="17"/>
+              <w:spacing w:after="20"/>
+            </w:pPr>
+            <w:r>
+              <w:rPr>
+                <w:b w:val="false"/>
+                <w:bCs w:val="false"/>
+                <w:sz w:val="21"/>
+                <w:szCs w:val="21"/>
               </w:rPr>
               <w:t xml:space="preserve">名物行事</w:t>
             </w:r>
@@ -1442,14 +1442,14 @@
           </w:tcPr>
           <w:p>
             <w:pPr>
-              <w:spacing w:after="20" w:line="260"/>
-            </w:pPr>
-            <w:r>
-              <w:rPr>
-                <w:b w:val="false"/>
-                <w:bCs w:val="false"/>
-                <w:sz w:val="17"/>
-                <w:szCs w:val="17"/>
+              <w:spacing w:after="20"/>
+            </w:pPr>
+            <w:r>
+              <w:rPr>
+                <w:b w:val="false"/>
+                <w:bCs w:val="false"/>
+                <w:sz w:val="21"/>
+                <w:szCs w:val="21"/>
               </w:rPr>
               <w:t xml:space="preserve">学院祭／海外・国内選択の修学旅行</w:t>
             </w:r>
@@ -1473,14 +1473,14 @@
           </w:tcPr>
           <w:p>
             <w:pPr>
-              <w:spacing w:after="20" w:line="260"/>
-            </w:pPr>
-            <w:r>
-              <w:rPr>
-                <w:b w:val="false"/>
-                <w:bCs w:val="false"/>
-                <w:sz w:val="17"/>
-                <w:szCs w:val="17"/>
+              <w:spacing w:after="20"/>
+            </w:pPr>
+            <w:r>
+              <w:rPr>
+                <w:b w:val="false"/>
+                <w:bCs w:val="false"/>
+                <w:sz w:val="21"/>
+                <w:szCs w:val="21"/>
               </w:rPr>
               <w:t xml:space="preserve">SSH由来の海外サイエンス研修／武庫川フェスティバル</w:t>
             </w:r>
@@ -1504,14 +1504,14 @@
           </w:tcPr>
           <w:p>
             <w:pPr>
-              <w:spacing w:after="20" w:line="260"/>
-            </w:pPr>
-            <w:r>
-              <w:rPr>
-                <w:b w:val="false"/>
-                <w:bCs w:val="false"/>
-                <w:sz w:val="17"/>
-                <w:szCs w:val="17"/>
+              <w:spacing w:after="20"/>
+            </w:pPr>
+            <w:r>
+              <w:rPr>
+                <w:b w:val="false"/>
+                <w:bCs w:val="false"/>
+                <w:sz w:val="21"/>
+                <w:szCs w:val="21"/>
               </w:rPr>
               <w:t xml:space="preserve">体育祭のカレドニアン／長期留学</w:t>
             </w:r>
@@ -1535,14 +1535,14 @@
           </w:tcPr>
           <w:p>
             <w:pPr>
-              <w:spacing w:after="20" w:line="260"/>
-            </w:pPr>
-            <w:r>
-              <w:rPr>
-                <w:b w:val="false"/>
-                <w:bCs w:val="false"/>
-                <w:sz w:val="17"/>
-                <w:szCs w:val="17"/>
+              <w:spacing w:after="20"/>
+            </w:pPr>
+            <w:r>
+              <w:rPr>
+                <w:b w:val="false"/>
+                <w:bCs w:val="false"/>
+                <w:sz w:val="21"/>
+                <w:szCs w:val="21"/>
               </w:rPr>
               <w:t xml:space="preserve">神龍祭／比叡山研修</w:t>
             </w:r>
@@ -1572,14 +1572,14 @@
           </w:tcPr>
           <w:p>
             <w:pPr>
-              <w:spacing w:after="20" w:line="260"/>
-            </w:pPr>
-            <w:r>
-              <w:rPr>
-                <w:b w:val="false"/>
-                <w:bCs w:val="false"/>
-                <w:sz w:val="17"/>
-                <w:szCs w:val="17"/>
+              <w:spacing w:after="20"/>
+            </w:pPr>
+            <w:r>
+              <w:rPr>
+                <w:b w:val="false"/>
+                <w:bCs w:val="false"/>
+                <w:sz w:val="21"/>
+                <w:szCs w:val="21"/>
               </w:rPr>
               <w:t xml:space="preserve">こんな人向き</w:t>
             </w:r>
@@ -1603,14 +1603,14 @@
           </w:tcPr>
           <w:p>
             <w:pPr>
-              <w:spacing w:after="20" w:line="260"/>
-            </w:pPr>
-            <w:r>
-              <w:rPr>
-                <w:b w:val="false"/>
-                <w:bCs w:val="false"/>
-                <w:sz w:val="17"/>
-                <w:szCs w:val="17"/>
+              <w:spacing w:after="20"/>
+            </w:pPr>
+            <w:r>
+              <w:rPr>
+                <w:b w:val="false"/>
+                <w:bCs w:val="false"/>
+                <w:sz w:val="21"/>
+                <w:szCs w:val="21"/>
               </w:rPr>
               <w:t xml:space="preserve">共学・駅近・バランス重視</w:t>
             </w:r>
@@ -1634,14 +1634,14 @@
           </w:tcPr>
           <w:p>
             <w:pPr>
-              <w:spacing w:after="20" w:line="260"/>
-            </w:pPr>
-            <w:r>
-              <w:rPr>
-                <w:b w:val="false"/>
-                <w:bCs w:val="false"/>
-                <w:sz w:val="17"/>
-                <w:szCs w:val="17"/>
+              <w:spacing w:after="20"/>
+            </w:pPr>
+            <w:r>
+              <w:rPr>
+                <w:b w:val="false"/>
+                <w:bCs w:val="false"/>
+                <w:sz w:val="21"/>
+                <w:szCs w:val="21"/>
               </w:rPr>
               <w:t xml:space="preserve">資格系（看護・薬・栄養）・理系女子</w:t>
             </w:r>
@@ -1665,14 +1665,14 @@
           </w:tcPr>
           <w:p>
             <w:pPr>
-              <w:spacing w:after="20" w:line="260"/>
-            </w:pPr>
-            <w:r>
-              <w:rPr>
-                <w:b w:val="false"/>
-                <w:bCs w:val="false"/>
-                <w:sz w:val="17"/>
-                <w:szCs w:val="17"/>
+              <w:spacing w:after="20"/>
+            </w:pPr>
+            <w:r>
+              <w:rPr>
+                <w:b w:val="false"/>
+                <w:bCs w:val="false"/>
+                <w:sz w:val="21"/>
+                <w:szCs w:val="21"/>
               </w:rPr>
               <w:t xml:space="preserve">伝統女子校・留学・教育系志望</w:t>
             </w:r>
@@ -1696,14 +1696,14 @@
           </w:tcPr>
           <w:p>
             <w:pPr>
-              <w:spacing w:after="20" w:line="260"/>
-            </w:pPr>
-            <w:r>
-              <w:rPr>
-                <w:b w:val="false"/>
-                <w:bCs w:val="false"/>
-                <w:sz w:val="17"/>
-                <w:szCs w:val="17"/>
+              <w:spacing w:after="20"/>
+            </w:pPr>
+            <w:r>
+              <w:rPr>
+                <w:b w:val="false"/>
+                <w:bCs w:val="false"/>
+                <w:sz w:val="21"/>
+                <w:szCs w:val="21"/>
               </w:rPr>
               <w:t xml:space="preserve">医療系志望・目的別に学びたい</w:t>
             </w:r>
@@ -1713,13 +1713,13 @@
     </w:tbl>
     <w:p>
       <w:pPr>
-        <w:spacing w:after="80" w:line="300"/>
+        <w:spacing w:after="80"/>
       </w:pPr>
       <w:r>
         <w:rPr>
           <w:color w:val="666666"/>
-          <w:sz w:val="17"/>
-          <w:szCs w:val="17"/>
+          <w:sz w:val="21"/>
+          <w:szCs w:val="21"/>
         </w:rPr>
         <w:t xml:space="preserve">◎○△は通学の目安です（自宅の場所によって変わります）。</w:t>
       </w:r>
@@ -1744,21 +1744,21 @@
           <w:ilvl w:val="0"/>
           <w:numId w:val="2"/>
         </w:numPr>
-        <w:spacing w:after="40" w:line="290"/>
+        <w:spacing w:after="40"/>
       </w:pPr>
       <w:r>
         <w:rPr>
           <w:b/>
           <w:bCs/>
-          <w:sz w:val="20"/>
-          <w:szCs w:val="20"/>
+          <w:sz w:val="21"/>
+          <w:szCs w:val="21"/>
         </w:rPr>
         <w:t xml:space="preserve">女子校（武庫川女子附属・親和女子）：</w:t>
       </w:r>
       <w:r>
         <w:rPr>
-          <w:sz w:val="20"/>
-          <w:szCs w:val="20"/>
+          <w:sz w:val="21"/>
+          <w:szCs w:val="21"/>
         </w:rPr>
         <w:t xml:space="preserve">異性の目を気にせず、リーダー役や理系分野にも積極的に挑戦しやすい。行事も生徒主体で盛り上がる。</w:t>
       </w:r>
@@ -1770,33 +1770,33 @@
           <w:ilvl w:val="0"/>
           <w:numId w:val="2"/>
         </w:numPr>
-        <w:spacing w:after="40" w:line="290"/>
+        <w:spacing w:after="40"/>
       </w:pPr>
       <w:r>
         <w:rPr>
           <w:b/>
           <w:bCs/>
-          <w:sz w:val="20"/>
-          <w:szCs w:val="20"/>
+          <w:sz w:val="21"/>
+          <w:szCs w:val="21"/>
         </w:rPr>
         <w:t xml:space="preserve">共学（神戸学院附属・神戸龍谷）：</w:t>
       </w:r>
       <w:r>
         <w:rPr>
-          <w:sz w:val="20"/>
-          <w:szCs w:val="20"/>
+          <w:sz w:val="21"/>
+          <w:szCs w:val="21"/>
         </w:rPr>
         <w:t xml:space="preserve">社会に近い環境で多様な価値観に触れられる。部活動や行事の種類が幅広い。</w:t>
       </w:r>
     </w:p>
     <w:p>
       <w:pPr>
-        <w:spacing w:after="80" w:line="300"/>
+        <w:spacing w:after="80"/>
       </w:pPr>
       <w:r>
         <w:rPr>
-          <w:sz w:val="20"/>
-          <w:szCs w:val="20"/>
+          <w:sz w:val="21"/>
+          <w:szCs w:val="21"/>
         </w:rPr>
         <w:t xml:space="preserve">どちらが良い・悪いではなく、「本人がどちらの雰囲気で一番力を出せるか」が大切です。文化祭など一般公開行事で、実際の空気を体感することをおすすめします。</w:t>
       </w:r>
@@ -1858,14 +1858,14 @@
           </w:tcPr>
           <w:p>
             <w:pPr>
-              <w:spacing w:after="20" w:line="260"/>
-            </w:pPr>
-            <w:r>
-              <w:rPr>
-                <w:b w:val="false"/>
-                <w:bCs w:val="false"/>
-                <w:sz w:val="17"/>
-                <w:szCs w:val="17"/>
+              <w:spacing w:after="20"/>
+            </w:pPr>
+            <w:r>
+              <w:rPr>
+                <w:b w:val="false"/>
+                <w:bCs w:val="false"/>
+                <w:sz w:val="21"/>
+                <w:szCs w:val="21"/>
               </w:rPr>
               <w:t xml:space="preserve">所在地</w:t>
             </w:r>
@@ -1889,14 +1889,14 @@
           </w:tcPr>
           <w:p>
             <w:pPr>
-              <w:spacing w:after="20" w:line="260"/>
-            </w:pPr>
-            <w:r>
-              <w:rPr>
-                <w:b w:val="false"/>
-                <w:bCs w:val="false"/>
-                <w:sz w:val="17"/>
-                <w:szCs w:val="17"/>
+              <w:spacing w:after="20"/>
+            </w:pPr>
+            <w:r>
+              <w:rPr>
+                <w:b w:val="false"/>
+                <w:bCs w:val="false"/>
+                <w:sz w:val="21"/>
+                <w:szCs w:val="21"/>
               </w:rPr>
               <w:t xml:space="preserve">神戸市中央区港島（ポートアイランド）　2016年にポートアイランドへ新校舎移転</w:t>
             </w:r>
@@ -1923,14 +1923,14 @@
           </w:tcPr>
           <w:p>
             <w:pPr>
-              <w:spacing w:after="20" w:line="260"/>
-            </w:pPr>
-            <w:r>
-              <w:rPr>
-                <w:b w:val="false"/>
-                <w:bCs w:val="false"/>
-                <w:sz w:val="17"/>
-                <w:szCs w:val="17"/>
+              <w:spacing w:after="20"/>
+            </w:pPr>
+            <w:r>
+              <w:rPr>
+                <w:b w:val="false"/>
+                <w:bCs w:val="false"/>
+                <w:sz w:val="21"/>
+                <w:szCs w:val="21"/>
               </w:rPr>
               <w:t xml:space="preserve">最寄り駅</w:t>
             </w:r>
@@ -1954,14 +1954,14 @@
           </w:tcPr>
           <w:p>
             <w:pPr>
-              <w:spacing w:after="20" w:line="260"/>
-            </w:pPr>
-            <w:r>
-              <w:rPr>
-                <w:b w:val="false"/>
-                <w:bCs w:val="false"/>
-                <w:sz w:val="17"/>
-                <w:szCs w:val="17"/>
+              <w:spacing w:after="20"/>
+            </w:pPr>
+            <w:r>
+              <w:rPr>
+                <w:b w:val="false"/>
+                <w:bCs w:val="false"/>
+                <w:sz w:val="21"/>
+                <w:szCs w:val="21"/>
               </w:rPr>
               <w:t xml:space="preserve">ポートライナー「みなとじま」駅 徒歩約1分　※三宮からポートライナーで約10分程度</w:t>
             </w:r>
@@ -1988,14 +1988,14 @@
           </w:tcPr>
           <w:p>
             <w:pPr>
-              <w:spacing w:after="20" w:line="260"/>
-            </w:pPr>
-            <w:r>
-              <w:rPr>
-                <w:b w:val="false"/>
-                <w:bCs w:val="false"/>
-                <w:sz w:val="17"/>
-                <w:szCs w:val="17"/>
+              <w:spacing w:after="20"/>
+            </w:pPr>
+            <w:r>
+              <w:rPr>
+                <w:b w:val="false"/>
+                <w:bCs w:val="false"/>
+                <w:sz w:val="21"/>
+                <w:szCs w:val="21"/>
               </w:rPr>
               <w:t xml:space="preserve">男女</w:t>
             </w:r>
@@ -2019,14 +2019,14 @@
           </w:tcPr>
           <w:p>
             <w:pPr>
-              <w:spacing w:after="20" w:line="260"/>
-            </w:pPr>
-            <w:r>
-              <w:rPr>
-                <w:b w:val="false"/>
-                <w:bCs w:val="false"/>
-                <w:sz w:val="17"/>
-                <w:szCs w:val="17"/>
+              <w:spacing w:after="20"/>
+            </w:pPr>
+            <w:r>
+              <w:rPr>
+                <w:b w:val="false"/>
+                <w:bCs w:val="false"/>
+                <w:sz w:val="21"/>
+                <w:szCs w:val="21"/>
               </w:rPr>
               <w:t xml:space="preserve">男女共学</w:t>
             </w:r>
@@ -2053,14 +2053,14 @@
           </w:tcPr>
           <w:p>
             <w:pPr>
-              <w:spacing w:after="20" w:line="260"/>
-            </w:pPr>
-            <w:r>
-              <w:rPr>
-                <w:b w:val="false"/>
-                <w:bCs w:val="false"/>
-                <w:sz w:val="17"/>
-                <w:szCs w:val="17"/>
+              <w:spacing w:after="20"/>
+            </w:pPr>
+            <w:r>
+              <w:rPr>
+                <w:b w:val="false"/>
+                <w:bCs w:val="false"/>
+                <w:sz w:val="21"/>
+                <w:szCs w:val="21"/>
               </w:rPr>
               <w:t xml:space="preserve">コース</w:t>
             </w:r>
@@ -2084,56 +2084,56 @@
           </w:tcPr>
           <w:p>
             <w:pPr>
-              <w:spacing w:after="20" w:line="260"/>
-            </w:pPr>
-            <w:r>
-              <w:rPr>
-                <w:b w:val="false"/>
-                <w:bCs w:val="false"/>
-                <w:sz w:val="17"/>
-                <w:szCs w:val="17"/>
+              <w:spacing w:after="20"/>
+            </w:pPr>
+            <w:r>
+              <w:rPr>
+                <w:b w:val="false"/>
+                <w:bCs w:val="false"/>
+                <w:sz w:val="21"/>
+                <w:szCs w:val="21"/>
               </w:rPr>
               <w:t xml:space="preserve">特進文理コース：国公立・難関私大の現役合格を目指す。理数・英語を重視</w:t>
             </w:r>
           </w:p>
           <w:p>
             <w:pPr>
-              <w:spacing w:after="20" w:line="260"/>
-            </w:pPr>
-            <w:r>
-              <w:rPr>
-                <w:b w:val="false"/>
-                <w:bCs w:val="false"/>
-                <w:sz w:val="17"/>
-                <w:szCs w:val="17"/>
+              <w:spacing w:after="20"/>
+            </w:pPr>
+            <w:r>
+              <w:rPr>
+                <w:b w:val="false"/>
+                <w:bCs w:val="false"/>
+                <w:sz w:val="21"/>
+                <w:szCs w:val="21"/>
               </w:rPr>
               <w:t xml:space="preserve">特進グローバルコース：語学力・国際感覚を養い、海外大学・国際系学部を目指す</w:t>
             </w:r>
           </w:p>
           <w:p>
             <w:pPr>
-              <w:spacing w:after="20" w:line="260"/>
-            </w:pPr>
-            <w:r>
-              <w:rPr>
-                <w:b w:val="false"/>
-                <w:bCs w:val="false"/>
-                <w:sz w:val="17"/>
-                <w:szCs w:val="17"/>
+              <w:spacing w:after="20"/>
+            </w:pPr>
+            <w:r>
+              <w:rPr>
+                <w:b w:val="false"/>
+                <w:bCs w:val="false"/>
+                <w:sz w:val="21"/>
+                <w:szCs w:val="21"/>
               </w:rPr>
               <w:t xml:space="preserve">総合進学コース：部活動と両立しながら進路別に学習（高2から文系・理系）</w:t>
             </w:r>
           </w:p>
           <w:p>
             <w:pPr>
-              <w:spacing w:after="20" w:line="260"/>
-            </w:pPr>
-            <w:r>
-              <w:rPr>
-                <w:b w:val="false"/>
-                <w:bCs w:val="false"/>
-                <w:sz w:val="17"/>
-                <w:szCs w:val="17"/>
+              <w:spacing w:after="20"/>
+            </w:pPr>
+            <w:r>
+              <w:rPr>
+                <w:b w:val="false"/>
+                <w:bCs w:val="false"/>
+                <w:sz w:val="21"/>
+                <w:szCs w:val="21"/>
               </w:rPr>
               <w:t xml:space="preserve">※情報サイトによっては「特進サイエンス／特進アカデミック」等の旧名称あり。最新の募集要項で要確認</w:t>
             </w:r>
@@ -2160,14 +2160,14 @@
           </w:tcPr>
           <w:p>
             <w:pPr>
-              <w:spacing w:after="20" w:line="260"/>
-            </w:pPr>
-            <w:r>
-              <w:rPr>
-                <w:b w:val="false"/>
-                <w:bCs w:val="false"/>
-                <w:sz w:val="17"/>
-                <w:szCs w:val="17"/>
+              <w:spacing w:after="20"/>
+            </w:pPr>
+            <w:r>
+              <w:rPr>
+                <w:b w:val="false"/>
+                <w:bCs w:val="false"/>
+                <w:sz w:val="21"/>
+                <w:szCs w:val="21"/>
               </w:rPr>
               <w:t xml:space="preserve">校風</w:t>
             </w:r>
@@ -2191,14 +2191,14 @@
           </w:tcPr>
           <w:p>
             <w:pPr>
-              <w:spacing w:after="20" w:line="260"/>
-            </w:pPr>
-            <w:r>
-              <w:rPr>
-                <w:b w:val="false"/>
-                <w:bCs w:val="false"/>
-                <w:sz w:val="17"/>
-                <w:szCs w:val="17"/>
+              <w:spacing w:after="20"/>
+            </w:pPr>
+            <w:r>
+              <w:rPr>
+                <w:b w:val="false"/>
+                <w:bCs w:val="false"/>
+                <w:sz w:val="21"/>
+                <w:szCs w:val="21"/>
               </w:rPr>
               <w:t xml:space="preserve">大学附属の安心感＋高大連携教育・ICT教育（1人1台タブレット）が柱。新しくきれいな校舎。部活動も盛んで、空手道部・硬式野球部などが全国レベルで活躍と紹介されている</w:t>
             </w:r>
@@ -2225,14 +2225,14 @@
           </w:tcPr>
           <w:p>
             <w:pPr>
-              <w:spacing w:after="20" w:line="260"/>
-            </w:pPr>
-            <w:r>
-              <w:rPr>
-                <w:b w:val="false"/>
-                <w:bCs w:val="false"/>
-                <w:sz w:val="17"/>
-                <w:szCs w:val="17"/>
+              <w:spacing w:after="20"/>
+            </w:pPr>
+            <w:r>
+              <w:rPr>
+                <w:b w:val="false"/>
+                <w:bCs w:val="false"/>
+                <w:sz w:val="21"/>
+                <w:szCs w:val="21"/>
               </w:rPr>
               <w:t xml:space="preserve">大学との関係</w:t>
             </w:r>
@@ -2256,14 +2256,14 @@
           </w:tcPr>
           <w:p>
             <w:pPr>
-              <w:spacing w:after="20" w:line="260"/>
-            </w:pPr>
-            <w:r>
-              <w:rPr>
-                <w:b w:val="false"/>
-                <w:bCs w:val="false"/>
-                <w:sz w:val="17"/>
-                <w:szCs w:val="17"/>
+              <w:spacing w:after="20"/>
+            </w:pPr>
+            <w:r>
+              <w:rPr>
+                <w:b w:val="false"/>
+                <w:bCs w:val="false"/>
+                <w:sz w:val="21"/>
+                <w:szCs w:val="21"/>
               </w:rPr>
               <w:t xml:space="preserve">神戸学院大学への特別推薦制度あり（内部進学の道がある）。一方で特進コースは国公立・難関私大への外部受験が前提</w:t>
             </w:r>
@@ -2290,14 +2290,14 @@
           </w:tcPr>
           <w:p>
             <w:pPr>
-              <w:spacing w:after="20" w:line="260"/>
-            </w:pPr>
-            <w:r>
-              <w:rPr>
-                <w:b w:val="false"/>
-                <w:bCs w:val="false"/>
-                <w:sz w:val="17"/>
-                <w:szCs w:val="17"/>
+              <w:spacing w:after="20"/>
+            </w:pPr>
+            <w:r>
+              <w:rPr>
+                <w:b w:val="false"/>
+                <w:bCs w:val="false"/>
+                <w:sz w:val="21"/>
+                <w:szCs w:val="21"/>
               </w:rPr>
               <w:t xml:space="preserve">制服</w:t>
             </w:r>
@@ -2321,14 +2321,14 @@
           </w:tcPr>
           <w:p>
             <w:pPr>
-              <w:spacing w:after="20" w:line="260"/>
-            </w:pPr>
-            <w:r>
-              <w:rPr>
-                <w:b w:val="false"/>
-                <w:bCs w:val="false"/>
-                <w:sz w:val="17"/>
-                <w:szCs w:val="17"/>
+              <w:spacing w:after="20"/>
+            </w:pPr>
+            <w:r>
+              <w:rPr>
+                <w:b w:val="false"/>
+                <w:bCs w:val="false"/>
+                <w:sz w:val="21"/>
+                <w:szCs w:val="21"/>
               </w:rPr>
               <w:t xml:space="preserve">男女ともブレザー</w:t>
             </w:r>
@@ -2387,14 +2387,14 @@
           </w:tcPr>
           <w:p>
             <w:pPr>
-              <w:spacing w:after="20" w:line="260"/>
-            </w:pPr>
-            <w:r>
-              <w:rPr>
-                <w:b w:val="false"/>
-                <w:bCs w:val="false"/>
-                <w:sz w:val="17"/>
-                <w:szCs w:val="17"/>
+              <w:spacing w:after="20"/>
+            </w:pPr>
+            <w:r>
+              <w:rPr>
+                <w:b w:val="false"/>
+                <w:bCs w:val="false"/>
+                <w:sz w:val="21"/>
+                <w:szCs w:val="21"/>
               </w:rPr>
               <w:t xml:space="preserve">4月</w:t>
             </w:r>
@@ -2418,14 +2418,14 @@
           </w:tcPr>
           <w:p>
             <w:pPr>
-              <w:spacing w:after="20" w:line="260"/>
-            </w:pPr>
-            <w:r>
-              <w:rPr>
-                <w:b w:val="false"/>
-                <w:bCs w:val="false"/>
-                <w:sz w:val="17"/>
-                <w:szCs w:val="17"/>
+              <w:spacing w:after="20"/>
+            </w:pPr>
+            <w:r>
+              <w:rPr>
+                <w:b w:val="false"/>
+                <w:bCs w:val="false"/>
+                <w:sz w:val="21"/>
+                <w:szCs w:val="21"/>
               </w:rPr>
               <w:t xml:space="preserve">宿泊研修（新入生）</w:t>
             </w:r>
@@ -2452,14 +2452,14 @@
           </w:tcPr>
           <w:p>
             <w:pPr>
-              <w:spacing w:after="20" w:line="260"/>
-            </w:pPr>
-            <w:r>
-              <w:rPr>
-                <w:b w:val="false"/>
-                <w:bCs w:val="false"/>
-                <w:sz w:val="17"/>
-                <w:szCs w:val="17"/>
+              <w:spacing w:after="20"/>
+            </w:pPr>
+            <w:r>
+              <w:rPr>
+                <w:b w:val="false"/>
+                <w:bCs w:val="false"/>
+                <w:sz w:val="21"/>
+                <w:szCs w:val="21"/>
               </w:rPr>
               <w:t xml:space="preserve">6月</w:t>
             </w:r>
@@ -2483,14 +2483,14 @@
           </w:tcPr>
           <w:p>
             <w:pPr>
-              <w:spacing w:after="20" w:line="260"/>
-            </w:pPr>
-            <w:r>
-              <w:rPr>
-                <w:b w:val="false"/>
-                <w:bCs w:val="false"/>
-                <w:sz w:val="17"/>
-                <w:szCs w:val="17"/>
+              <w:spacing w:after="20"/>
+            </w:pPr>
+            <w:r>
+              <w:rPr>
+                <w:b w:val="false"/>
+                <w:bCs w:val="false"/>
+                <w:sz w:val="21"/>
+                <w:szCs w:val="21"/>
               </w:rPr>
               <w:t xml:space="preserve">体育大会</w:t>
             </w:r>
@@ -2517,14 +2517,14 @@
           </w:tcPr>
           <w:p>
             <w:pPr>
-              <w:spacing w:after="20" w:line="260"/>
-            </w:pPr>
-            <w:r>
-              <w:rPr>
-                <w:b w:val="false"/>
-                <w:bCs w:val="false"/>
-                <w:sz w:val="17"/>
-                <w:szCs w:val="17"/>
+              <w:spacing w:after="20"/>
+            </w:pPr>
+            <w:r>
+              <w:rPr>
+                <w:b w:val="false"/>
+                <w:bCs w:val="false"/>
+                <w:sz w:val="21"/>
+                <w:szCs w:val="21"/>
               </w:rPr>
               <w:t xml:space="preserve">8月</w:t>
             </w:r>
@@ -2548,14 +2548,14 @@
           </w:tcPr>
           <w:p>
             <w:pPr>
-              <w:spacing w:after="20" w:line="260"/>
-            </w:pPr>
-            <w:r>
-              <w:rPr>
-                <w:b w:val="false"/>
-                <w:bCs w:val="false"/>
-                <w:sz w:val="17"/>
-                <w:szCs w:val="17"/>
+              <w:spacing w:after="20"/>
+            </w:pPr>
+            <w:r>
+              <w:rPr>
+                <w:b w:val="false"/>
+                <w:bCs w:val="false"/>
+                <w:sz w:val="21"/>
+                <w:szCs w:val="21"/>
               </w:rPr>
               <w:t xml:space="preserve">夏期学習合宿</w:t>
             </w:r>
@@ -2582,14 +2582,14 @@
           </w:tcPr>
           <w:p>
             <w:pPr>
-              <w:spacing w:after="20" w:line="260"/>
-            </w:pPr>
-            <w:r>
-              <w:rPr>
-                <w:b w:val="false"/>
-                <w:bCs w:val="false"/>
-                <w:sz w:val="17"/>
-                <w:szCs w:val="17"/>
+              <w:spacing w:after="20"/>
+            </w:pPr>
+            <w:r>
+              <w:rPr>
+                <w:b w:val="false"/>
+                <w:bCs w:val="false"/>
+                <w:sz w:val="21"/>
+                <w:szCs w:val="21"/>
               </w:rPr>
               <w:t xml:space="preserve">10月</w:t>
             </w:r>
@@ -2613,14 +2613,14 @@
           </w:tcPr>
           <w:p>
             <w:pPr>
-              <w:spacing w:after="20" w:line="260"/>
-            </w:pPr>
-            <w:r>
-              <w:rPr>
-                <w:b w:val="false"/>
-                <w:bCs w:val="false"/>
-                <w:sz w:val="17"/>
-                <w:szCs w:val="17"/>
+              <w:spacing w:after="20"/>
+            </w:pPr>
+            <w:r>
+              <w:rPr>
+                <w:b w:val="false"/>
+                <w:bCs w:val="false"/>
+                <w:sz w:val="21"/>
+                <w:szCs w:val="21"/>
               </w:rPr>
               <w:t xml:space="preserve">学院祭（文化祭）・校外学習／2年生の修学旅行（海外・国内から選択制）</w:t>
             </w:r>
@@ -2647,14 +2647,14 @@
           </w:tcPr>
           <w:p>
             <w:pPr>
-              <w:spacing w:after="20" w:line="260"/>
-            </w:pPr>
-            <w:r>
-              <w:rPr>
-                <w:b w:val="false"/>
-                <w:bCs w:val="false"/>
-                <w:sz w:val="17"/>
-                <w:szCs w:val="17"/>
+              <w:spacing w:after="20"/>
+            </w:pPr>
+            <w:r>
+              <w:rPr>
+                <w:b w:val="false"/>
+                <w:bCs w:val="false"/>
+                <w:sz w:val="21"/>
+                <w:szCs w:val="21"/>
               </w:rPr>
               <w:t xml:space="preserve">その他</w:t>
             </w:r>
@@ -2678,14 +2678,14 @@
           </w:tcPr>
           <w:p>
             <w:pPr>
-              <w:spacing w:after="20" w:line="260"/>
-            </w:pPr>
-            <w:r>
-              <w:rPr>
-                <w:b w:val="false"/>
-                <w:bCs w:val="false"/>
-                <w:sz w:val="17"/>
-                <w:szCs w:val="17"/>
+              <w:spacing w:after="20"/>
+            </w:pPr>
+            <w:r>
+              <w:rPr>
+                <w:b w:val="false"/>
+                <w:bCs w:val="false"/>
+                <w:sz w:val="21"/>
+                <w:szCs w:val="21"/>
               </w:rPr>
               <w:t xml:space="preserve">合唱コンクール、オーストラリア語学研修、短期留学などの国際交流</w:t>
             </w:r>
@@ -2742,13 +2742,10 @@
             </w:tcMar>
           </w:tcPr>
           <w:p>
-            <w:pPr>
-              <w:spacing w:line="290"/>
-            </w:pPr>
-            <w:r>
-              <w:rPr>
-                <w:sz w:val="19"/>
-                <w:szCs w:val="19"/>
+            <w:r>
+              <w:rPr>
+                <w:sz w:val="21"/>
+                <w:szCs w:val="21"/>
               </w:rPr>
               <w:t xml:space="preserve">「三宮から近い・駅から1分・共学・大学附属」とバランス型。特進で国公立を狙いつつ、内部推薦という保険も持てる。女子校の雰囲気より共学を希望する場合の有力候補。</w:t>
             </w:r>
@@ -2805,14 +2802,14 @@
           </w:tcPr>
           <w:p>
             <w:pPr>
-              <w:spacing w:after="20" w:line="260"/>
-            </w:pPr>
-            <w:r>
-              <w:rPr>
-                <w:b w:val="false"/>
-                <w:bCs w:val="false"/>
-                <w:sz w:val="17"/>
-                <w:szCs w:val="17"/>
+              <w:spacing w:after="20"/>
+            </w:pPr>
+            <w:r>
+              <w:rPr>
+                <w:b w:val="false"/>
+                <w:bCs w:val="false"/>
+                <w:sz w:val="21"/>
+                <w:szCs w:val="21"/>
               </w:rPr>
               <w:t xml:space="preserve">所在地</w:t>
             </w:r>
@@ -2836,14 +2833,14 @@
           </w:tcPr>
           <w:p>
             <w:pPr>
-              <w:spacing w:after="20" w:line="260"/>
-            </w:pPr>
-            <w:r>
-              <w:rPr>
-                <w:b w:val="false"/>
-                <w:bCs w:val="false"/>
-                <w:sz w:val="17"/>
-                <w:szCs w:val="17"/>
+              <w:spacing w:after="20"/>
+            </w:pPr>
+            <w:r>
+              <w:rPr>
+                <w:b w:val="false"/>
+                <w:bCs w:val="false"/>
+                <w:sz w:val="21"/>
+                <w:szCs w:val="21"/>
               </w:rPr>
               <w:t xml:space="preserve">兵庫県西宮市（武庫川女子大学キャンパス隣接）</w:t>
             </w:r>
@@ -2870,14 +2867,14 @@
           </w:tcPr>
           <w:p>
             <w:pPr>
-              <w:spacing w:after="20" w:line="260"/>
-            </w:pPr>
-            <w:r>
-              <w:rPr>
-                <w:b w:val="false"/>
-                <w:bCs w:val="false"/>
-                <w:sz w:val="17"/>
-                <w:szCs w:val="17"/>
+              <w:spacing w:after="20"/>
+            </w:pPr>
+            <w:r>
+              <w:rPr>
+                <w:b w:val="false"/>
+                <w:bCs w:val="false"/>
+                <w:sz w:val="21"/>
+                <w:szCs w:val="21"/>
               </w:rPr>
               <w:t xml:space="preserve">最寄り駅</w:t>
             </w:r>
@@ -2901,14 +2898,14 @@
           </w:tcPr>
           <w:p>
             <w:pPr>
-              <w:spacing w:after="20" w:line="260"/>
-            </w:pPr>
-            <w:r>
-              <w:rPr>
-                <w:b w:val="false"/>
-                <w:bCs w:val="false"/>
-                <w:sz w:val="17"/>
-                <w:szCs w:val="17"/>
+              <w:spacing w:after="20"/>
+            </w:pPr>
+            <w:r>
+              <w:rPr>
+                <w:b w:val="false"/>
+                <w:bCs w:val="false"/>
+                <w:sz w:val="21"/>
+                <w:szCs w:val="21"/>
               </w:rPr>
               <w:t xml:space="preserve">阪神本線「鳴尾・武庫川女子大前」駅 徒歩約15分（案内による）／阪神「甲子園」駅から阪神バス「武庫川女子大学附属中高前」下車／阪急「西宮北口」から直通バスの案内あり</w:t>
             </w:r>
@@ -2935,14 +2932,14 @@
           </w:tcPr>
           <w:p>
             <w:pPr>
-              <w:spacing w:after="20" w:line="260"/>
-            </w:pPr>
-            <w:r>
-              <w:rPr>
-                <w:b w:val="false"/>
-                <w:bCs w:val="false"/>
-                <w:sz w:val="17"/>
-                <w:szCs w:val="17"/>
+              <w:spacing w:after="20"/>
+            </w:pPr>
+            <w:r>
+              <w:rPr>
+                <w:b w:val="false"/>
+                <w:bCs w:val="false"/>
+                <w:sz w:val="21"/>
+                <w:szCs w:val="21"/>
               </w:rPr>
               <w:t xml:space="preserve">男女</w:t>
             </w:r>
@@ -2966,14 +2963,14 @@
           </w:tcPr>
           <w:p>
             <w:pPr>
-              <w:spacing w:after="20" w:line="260"/>
-            </w:pPr>
-            <w:r>
-              <w:rPr>
-                <w:b w:val="false"/>
-                <w:bCs w:val="false"/>
-                <w:sz w:val="17"/>
-                <w:szCs w:val="17"/>
+              <w:spacing w:after="20"/>
+            </w:pPr>
+            <w:r>
+              <w:rPr>
+                <w:b w:val="false"/>
+                <w:bCs w:val="false"/>
+                <w:sz w:val="21"/>
+                <w:szCs w:val="21"/>
               </w:rPr>
               <w:t xml:space="preserve">女子校（大学は2027年4月に共学化し「武庫川大学」へ改称予定だが、附属中高は女子校を継続と報道）</w:t>
             </w:r>
@@ -3000,14 +2997,14 @@
           </w:tcPr>
           <w:p>
             <w:pPr>
-              <w:spacing w:after="20" w:line="260"/>
-            </w:pPr>
-            <w:r>
-              <w:rPr>
-                <w:b w:val="false"/>
-                <w:bCs w:val="false"/>
-                <w:sz w:val="17"/>
-                <w:szCs w:val="17"/>
+              <w:spacing w:after="20"/>
+            </w:pPr>
+            <w:r>
+              <w:rPr>
+                <w:b w:val="false"/>
+                <w:bCs w:val="false"/>
+                <w:sz w:val="21"/>
+                <w:szCs w:val="21"/>
               </w:rPr>
               <w:t xml:space="preserve">校名変更</w:t>
             </w:r>
@@ -3031,14 +3028,14 @@
           </w:tcPr>
           <w:p>
             <w:pPr>
-              <w:spacing w:after="20" w:line="260"/>
-            </w:pPr>
-            <w:r>
-              <w:rPr>
-                <w:b w:val="false"/>
-                <w:bCs w:val="false"/>
-                <w:sz w:val="17"/>
-                <w:szCs w:val="17"/>
+              <w:spacing w:after="20"/>
+            </w:pPr>
+            <w:r>
+              <w:rPr>
+                <w:b w:val="false"/>
+                <w:bCs w:val="false"/>
+                <w:sz w:val="21"/>
+                <w:szCs w:val="21"/>
               </w:rPr>
               <w:t xml:space="preserve">2027年4月から「武庫川大学附属女子高等学校」に改称予定。今の中2生が入学する2028年4月には新校名になっている見込み</w:t>
             </w:r>
@@ -3065,14 +3062,14 @@
           </w:tcPr>
           <w:p>
             <w:pPr>
-              <w:spacing w:after="20" w:line="260"/>
-            </w:pPr>
-            <w:r>
-              <w:rPr>
-                <w:b w:val="false"/>
-                <w:bCs w:val="false"/>
-                <w:sz w:val="17"/>
-                <w:szCs w:val="17"/>
+              <w:spacing w:after="20"/>
+            </w:pPr>
+            <w:r>
+              <w:rPr>
+                <w:b w:val="false"/>
+                <w:bCs w:val="false"/>
+                <w:sz w:val="21"/>
+                <w:szCs w:val="21"/>
               </w:rPr>
               <w:t xml:space="preserve">コース</w:t>
             </w:r>
@@ -3096,42 +3093,42 @@
           </w:tcPr>
           <w:p>
             <w:pPr>
-              <w:spacing w:after="20" w:line="260"/>
-            </w:pPr>
-            <w:r>
-              <w:rPr>
-                <w:b w:val="false"/>
-                <w:bCs w:val="false"/>
-                <w:sz w:val="17"/>
-                <w:szCs w:val="17"/>
+              <w:spacing w:after="20"/>
+            </w:pPr>
+            <w:r>
+              <w:rPr>
+                <w:b w:val="false"/>
+                <w:bCs w:val="false"/>
+                <w:sz w:val="21"/>
+                <w:szCs w:val="21"/>
               </w:rPr>
               <w:t xml:space="preserve">SOARグローバルサイエンス（GS）コース（募集約20名）：科学的探究＋英語力・異文化理解。海外でのサイエンス研修あり</w:t>
             </w:r>
           </w:p>
           <w:p>
             <w:pPr>
-              <w:spacing w:after="20" w:line="260"/>
-            </w:pPr>
-            <w:r>
-              <w:rPr>
-                <w:b w:val="false"/>
-                <w:bCs w:val="false"/>
-                <w:sz w:val="17"/>
-                <w:szCs w:val="17"/>
+              <w:spacing w:after="20"/>
+            </w:pPr>
+            <w:r>
+              <w:rPr>
+                <w:b w:val="false"/>
+                <w:bCs w:val="false"/>
+                <w:sz w:val="21"/>
+                <w:szCs w:val="21"/>
               </w:rPr>
               <w:t xml:space="preserve">SOAR探究コース（募集約140名）：地域機関や武庫川女子大学と連携した探究活動</w:t>
             </w:r>
           </w:p>
           <w:p>
             <w:pPr>
-              <w:spacing w:after="20" w:line="260"/>
-            </w:pPr>
-            <w:r>
-              <w:rPr>
-                <w:b w:val="false"/>
-                <w:bCs w:val="false"/>
-                <w:sz w:val="17"/>
-                <w:szCs w:val="17"/>
+              <w:spacing w:after="20"/>
+            </w:pPr>
+            <w:r>
+              <w:rPr>
+                <w:b w:val="false"/>
+                <w:bCs w:val="false"/>
+                <w:sz w:val="21"/>
+                <w:szCs w:val="21"/>
               </w:rPr>
               <w:t xml:space="preserve">※2024年度から現行2コース制</w:t>
             </w:r>
@@ -3158,14 +3155,14 @@
           </w:tcPr>
           <w:p>
             <w:pPr>
-              <w:spacing w:after="20" w:line="260"/>
-            </w:pPr>
-            <w:r>
-              <w:rPr>
-                <w:b w:val="false"/>
-                <w:bCs w:val="false"/>
-                <w:sz w:val="17"/>
-                <w:szCs w:val="17"/>
+              <w:spacing w:after="20"/>
+            </w:pPr>
+            <w:r>
+              <w:rPr>
+                <w:b w:val="false"/>
+                <w:bCs w:val="false"/>
+                <w:sz w:val="21"/>
+                <w:szCs w:val="21"/>
               </w:rPr>
               <w:t xml:space="preserve">校風</w:t>
             </w:r>
@@ -3189,14 +3186,14 @@
           </w:tcPr>
           <w:p>
             <w:pPr>
-              <w:spacing w:after="20" w:line="260"/>
-            </w:pPr>
-            <w:r>
-              <w:rPr>
-                <w:b w:val="false"/>
-                <w:bCs w:val="false"/>
-                <w:sz w:val="17"/>
-                <w:szCs w:val="17"/>
+              <w:spacing w:after="20"/>
+            </w:pPr>
+            <w:r>
+              <w:rPr>
+                <w:b w:val="false"/>
+                <w:bCs w:val="false"/>
+                <w:sz w:val="21"/>
+                <w:szCs w:val="21"/>
               </w:rPr>
               <w:t xml:space="preserve">関西有数の大規模女子校。2006年に私立女子校として全国初のSSH（スーパーサイエンスハイスクール）指定を受けた理系教育の伝統。文武両道で部活動も盛ん</w:t>
             </w:r>
@@ -3223,14 +3220,14 @@
           </w:tcPr>
           <w:p>
             <w:pPr>
-              <w:spacing w:after="20" w:line="260"/>
-            </w:pPr>
-            <w:r>
-              <w:rPr>
-                <w:b w:val="false"/>
-                <w:bCs w:val="false"/>
-                <w:sz w:val="17"/>
-                <w:szCs w:val="17"/>
+              <w:spacing w:after="20"/>
+            </w:pPr>
+            <w:r>
+              <w:rPr>
+                <w:b w:val="false"/>
+                <w:bCs w:val="false"/>
+                <w:sz w:val="21"/>
+                <w:szCs w:val="21"/>
               </w:rPr>
               <w:t xml:space="preserve">大学との関係</w:t>
             </w:r>
@@ -3254,14 +3251,14 @@
           </w:tcPr>
           <w:p>
             <w:pPr>
-              <w:spacing w:after="20" w:line="260"/>
-            </w:pPr>
-            <w:r>
-              <w:rPr>
-                <w:b w:val="false"/>
-                <w:bCs w:val="false"/>
-                <w:sz w:val="17"/>
-                <w:szCs w:val="17"/>
+              <w:spacing w:after="20"/>
+            </w:pPr>
+            <w:r>
+              <w:rPr>
+                <w:b w:val="false"/>
+                <w:bCs w:val="false"/>
+                <w:sz w:val="21"/>
+                <w:szCs w:val="21"/>
               </w:rPr>
               <w:t xml:space="preserve">卒業生の約8割が内部推薦で武庫川女子大学・短大へ進学（進研ゼミ情報）。薬学・看護・食物栄養・教育・建築など女子に人気の学部が揃う</w:t>
             </w:r>
@@ -3320,14 +3317,14 @@
           </w:tcPr>
           <w:p>
             <w:pPr>
-              <w:spacing w:after="20" w:line="260"/>
-            </w:pPr>
-            <w:r>
-              <w:rPr>
-                <w:b w:val="false"/>
-                <w:bCs w:val="false"/>
-                <w:sz w:val="17"/>
-                <w:szCs w:val="17"/>
+              <w:spacing w:after="20"/>
+            </w:pPr>
+            <w:r>
+              <w:rPr>
+                <w:b w:val="false"/>
+                <w:bCs w:val="false"/>
+                <w:sz w:val="21"/>
+                <w:szCs w:val="21"/>
               </w:rPr>
               <w:t xml:space="preserve">6月</w:t>
             </w:r>
@@ -3351,14 +3348,14 @@
           </w:tcPr>
           <w:p>
             <w:pPr>
-              <w:spacing w:after="20" w:line="260"/>
-            </w:pPr>
-            <w:r>
-              <w:rPr>
-                <w:b w:val="false"/>
-                <w:bCs w:val="false"/>
-                <w:sz w:val="17"/>
-                <w:szCs w:val="17"/>
+              <w:spacing w:after="20"/>
+            </w:pPr>
+            <w:r>
+              <w:rPr>
+                <w:b w:val="false"/>
+                <w:bCs w:val="false"/>
+                <w:sz w:val="21"/>
+                <w:szCs w:val="21"/>
               </w:rPr>
               <w:t xml:space="preserve">修学旅行（高校）・校外合宿研修</w:t>
             </w:r>
@@ -3385,14 +3382,14 @@
           </w:tcPr>
           <w:p>
             <w:pPr>
-              <w:spacing w:after="20" w:line="260"/>
-            </w:pPr>
-            <w:r>
-              <w:rPr>
-                <w:b w:val="false"/>
-                <w:bCs w:val="false"/>
-                <w:sz w:val="17"/>
-                <w:szCs w:val="17"/>
+              <w:spacing w:after="20"/>
+            </w:pPr>
+            <w:r>
+              <w:rPr>
+                <w:b w:val="false"/>
+                <w:bCs w:val="false"/>
+                <w:sz w:val="21"/>
+                <w:szCs w:val="21"/>
               </w:rPr>
               <w:t xml:space="preserve">10月</w:t>
             </w:r>
@@ -3416,14 +3413,14 @@
           </w:tcPr>
           <w:p>
             <w:pPr>
-              <w:spacing w:after="20" w:line="260"/>
-            </w:pPr>
-            <w:r>
-              <w:rPr>
-                <w:b w:val="false"/>
-                <w:bCs w:val="false"/>
-                <w:sz w:val="17"/>
-                <w:szCs w:val="17"/>
+              <w:spacing w:after="20"/>
+            </w:pPr>
+            <w:r>
+              <w:rPr>
+                <w:b w:val="false"/>
+                <w:bCs w:val="false"/>
+                <w:sz w:val="21"/>
+                <w:szCs w:val="21"/>
               </w:rPr>
               <w:t xml:space="preserve">体育大会</w:t>
             </w:r>
@@ -3450,14 +3447,14 @@
           </w:tcPr>
           <w:p>
             <w:pPr>
-              <w:spacing w:after="20" w:line="260"/>
-            </w:pPr>
-            <w:r>
-              <w:rPr>
-                <w:b w:val="false"/>
-                <w:bCs w:val="false"/>
-                <w:sz w:val="17"/>
-                <w:szCs w:val="17"/>
+              <w:spacing w:after="20"/>
+            </w:pPr>
+            <w:r>
+              <w:rPr>
+                <w:b w:val="false"/>
+                <w:bCs w:val="false"/>
+                <w:sz w:val="21"/>
+                <w:szCs w:val="21"/>
               </w:rPr>
               <w:t xml:space="preserve">11月</w:t>
             </w:r>
@@ -3481,14 +3478,14 @@
           </w:tcPr>
           <w:p>
             <w:pPr>
-              <w:spacing w:after="20" w:line="260"/>
-            </w:pPr>
-            <w:r>
-              <w:rPr>
-                <w:b w:val="false"/>
-                <w:bCs w:val="false"/>
-                <w:sz w:val="17"/>
-                <w:szCs w:val="17"/>
+              <w:spacing w:after="20"/>
+            </w:pPr>
+            <w:r>
+              <w:rPr>
+                <w:b w:val="false"/>
+                <w:bCs w:val="false"/>
+                <w:sz w:val="21"/>
+                <w:szCs w:val="21"/>
               </w:rPr>
               <w:t xml:space="preserve">文化祭「武庫川フェスティバル」（2026年度は11/6・7）</w:t>
             </w:r>
@@ -3515,14 +3512,14 @@
           </w:tcPr>
           <w:p>
             <w:pPr>
-              <w:spacing w:after="20" w:line="260"/>
-            </w:pPr>
-            <w:r>
-              <w:rPr>
-                <w:b w:val="false"/>
-                <w:bCs w:val="false"/>
-                <w:sz w:val="17"/>
-                <w:szCs w:val="17"/>
+              <w:spacing w:after="20"/>
+            </w:pPr>
+            <w:r>
+              <w:rPr>
+                <w:b w:val="false"/>
+                <w:bCs w:val="false"/>
+                <w:sz w:val="21"/>
+                <w:szCs w:val="21"/>
               </w:rPr>
               <w:t xml:space="preserve">その他</w:t>
             </w:r>
@@ -3546,14 +3543,14 @@
           </w:tcPr>
           <w:p>
             <w:pPr>
-              <w:spacing w:after="20" w:line="260"/>
-            </w:pPr>
-            <w:r>
-              <w:rPr>
-                <w:b w:val="false"/>
-                <w:bCs w:val="false"/>
-                <w:sz w:val="17"/>
-                <w:szCs w:val="17"/>
+              <w:spacing w:after="20"/>
+            </w:pPr>
+            <w:r>
+              <w:rPr>
+                <w:b w:val="false"/>
+                <w:bCs w:val="false"/>
+                <w:sz w:val="21"/>
+                <w:szCs w:val="21"/>
               </w:rPr>
               <w:t xml:space="preserve">芸術鑑賞会、クリスマスミニコンサート、合唱コンクール、百人一首大会、GSコースの海外研修</w:t>
             </w:r>
@@ -3610,13 +3607,10 @@
             </w:tcMar>
           </w:tcPr>
           <w:p>
-            <w:pPr>
-              <w:spacing w:line="290"/>
-            </w:pPr>
-            <w:r>
-              <w:rPr>
-                <w:sz w:val="19"/>
-                <w:szCs w:val="19"/>
+            <w:r>
+              <w:rPr>
+                <w:sz w:val="21"/>
+                <w:szCs w:val="21"/>
               </w:rPr>
               <w:t xml:space="preserve">「大学までの一貫進学で、看護・薬学・栄養・教育など資格系を目指したい」女子に強い。理系女子（GSコース）の環境は4校の中で最も充実。通学は阪神沿線・西宮方面が便利。</w:t>
             </w:r>
@@ -3673,14 +3667,14 @@
           </w:tcPr>
           <w:p>
             <w:pPr>
-              <w:spacing w:after="20" w:line="260"/>
-            </w:pPr>
-            <w:r>
-              <w:rPr>
-                <w:b w:val="false"/>
-                <w:bCs w:val="false"/>
-                <w:sz w:val="17"/>
-                <w:szCs w:val="17"/>
+              <w:spacing w:after="20"/>
+            </w:pPr>
+            <w:r>
+              <w:rPr>
+                <w:b w:val="false"/>
+                <w:bCs w:val="false"/>
+                <w:sz w:val="21"/>
+                <w:szCs w:val="21"/>
               </w:rPr>
               <w:t xml:space="preserve">所在地</w:t>
             </w:r>
@@ -3704,14 +3698,14 @@
           </w:tcPr>
           <w:p>
             <w:pPr>
-              <w:spacing w:after="20" w:line="260"/>
-            </w:pPr>
-            <w:r>
-              <w:rPr>
-                <w:b w:val="false"/>
-                <w:bCs w:val="false"/>
-                <w:sz w:val="17"/>
-                <w:szCs w:val="17"/>
+              <w:spacing w:after="20"/>
+            </w:pPr>
+            <w:r>
+              <w:rPr>
+                <w:b w:val="false"/>
+                <w:bCs w:val="false"/>
+                <w:sz w:val="21"/>
+                <w:szCs w:val="21"/>
               </w:rPr>
               <w:t xml:space="preserve">神戸市灘区土山町6-1（六甲山麓の高台）</w:t>
             </w:r>
@@ -3738,14 +3732,14 @@
           </w:tcPr>
           <w:p>
             <w:pPr>
-              <w:spacing w:after="20" w:line="260"/>
-            </w:pPr>
-            <w:r>
-              <w:rPr>
-                <w:b w:val="false"/>
-                <w:bCs w:val="false"/>
-                <w:sz w:val="17"/>
-                <w:szCs w:val="17"/>
+              <w:spacing w:after="20"/>
+            </w:pPr>
+            <w:r>
+              <w:rPr>
+                <w:b w:val="false"/>
+                <w:bCs w:val="false"/>
+                <w:sz w:val="21"/>
+                <w:szCs w:val="21"/>
               </w:rPr>
               <w:t xml:space="preserve">最寄り駅</w:t>
             </w:r>
@@ -3769,14 +3763,14 @@
           </w:tcPr>
           <w:p>
             <w:pPr>
-              <w:spacing w:after="20" w:line="260"/>
-            </w:pPr>
-            <w:r>
-              <w:rPr>
-                <w:b w:val="false"/>
-                <w:bCs w:val="false"/>
-                <w:sz w:val="17"/>
-                <w:szCs w:val="17"/>
+              <w:spacing w:after="20"/>
+            </w:pPr>
+            <w:r>
+              <w:rPr>
+                <w:b w:val="false"/>
+                <w:bCs w:val="false"/>
+                <w:sz w:val="21"/>
+                <w:szCs w:val="21"/>
               </w:rPr>
               <w:t xml:space="preserve">阪急神戸線「六甲」駅 徒歩約15分（坂道あり）</w:t>
             </w:r>
@@ -3803,14 +3797,14 @@
           </w:tcPr>
           <w:p>
             <w:pPr>
-              <w:spacing w:after="20" w:line="260"/>
-            </w:pPr>
-            <w:r>
-              <w:rPr>
-                <w:b w:val="false"/>
-                <w:bCs w:val="false"/>
-                <w:sz w:val="17"/>
-                <w:szCs w:val="17"/>
+              <w:spacing w:after="20"/>
+            </w:pPr>
+            <w:r>
+              <w:rPr>
+                <w:b w:val="false"/>
+                <w:bCs w:val="false"/>
+                <w:sz w:val="21"/>
+                <w:szCs w:val="21"/>
               </w:rPr>
               <w:t xml:space="preserve">男女</w:t>
             </w:r>
@@ -3834,14 +3828,14 @@
           </w:tcPr>
           <w:p>
             <w:pPr>
-              <w:spacing w:after="20" w:line="260"/>
-            </w:pPr>
-            <w:r>
-              <w:rPr>
-                <w:b w:val="false"/>
-                <w:bCs w:val="false"/>
-                <w:sz w:val="17"/>
-                <w:szCs w:val="17"/>
+              <w:spacing w:after="20"/>
+            </w:pPr>
+            <w:r>
+              <w:rPr>
+                <w:b w:val="false"/>
+                <w:bCs w:val="false"/>
+                <w:sz w:val="21"/>
+                <w:szCs w:val="21"/>
               </w:rPr>
               <w:t xml:space="preserve">女子校　※併設の親和中学校は2025年度から「女子部」「共学部」を併置。高校は女子校のまま</w:t>
             </w:r>
@@ -3868,14 +3862,14 @@
           </w:tcPr>
           <w:p>
             <w:pPr>
-              <w:spacing w:after="20" w:line="260"/>
-            </w:pPr>
-            <w:r>
-              <w:rPr>
-                <w:b w:val="false"/>
-                <w:bCs w:val="false"/>
-                <w:sz w:val="17"/>
-                <w:szCs w:val="17"/>
+              <w:spacing w:after="20"/>
+            </w:pPr>
+            <w:r>
+              <w:rPr>
+                <w:b w:val="false"/>
+                <w:bCs w:val="false"/>
+                <w:sz w:val="21"/>
+                <w:szCs w:val="21"/>
               </w:rPr>
               <w:t xml:space="preserve">コース（2026年度募集）</w:t>
             </w:r>
@@ -3899,42 +3893,42 @@
           </w:tcPr>
           <w:p>
             <w:pPr>
-              <w:spacing w:after="20" w:line="260"/>
-            </w:pPr>
-            <w:r>
-              <w:rPr>
-                <w:b w:val="false"/>
-                <w:bCs w:val="false"/>
-                <w:sz w:val="17"/>
-                <w:szCs w:val="17"/>
+              <w:spacing w:after="20"/>
+            </w:pPr>
+            <w:r>
+              <w:rPr>
+                <w:b w:val="false"/>
+                <w:bCs w:val="false"/>
+                <w:sz w:val="21"/>
+                <w:szCs w:val="21"/>
               </w:rPr>
               <w:t xml:space="preserve">アドバンストコース（約60名）：国公立・難関私大を目指す</w:t>
             </w:r>
           </w:p>
           <w:p>
             <w:pPr>
-              <w:spacing w:after="20" w:line="260"/>
-            </w:pPr>
-            <w:r>
-              <w:rPr>
-                <w:b w:val="false"/>
-                <w:bCs w:val="false"/>
-                <w:sz w:val="17"/>
-                <w:szCs w:val="17"/>
+              <w:spacing w:after="20"/>
+            </w:pPr>
+            <w:r>
+              <w:rPr>
+                <w:b w:val="false"/>
+                <w:bCs w:val="false"/>
+                <w:sz w:val="21"/>
+                <w:szCs w:val="21"/>
               </w:rPr>
               <w:t xml:space="preserve">スポーツ・カルチャーコース（約30名）：神戸親和大学との高大接続でスポーツ・芸術・教育系を目指す</w:t>
             </w:r>
           </w:p>
           <w:p>
             <w:pPr>
-              <w:spacing w:after="20" w:line="260"/>
-            </w:pPr>
-            <w:r>
-              <w:rPr>
-                <w:b w:val="false"/>
-                <w:bCs w:val="false"/>
-                <w:sz w:val="17"/>
-                <w:szCs w:val="17"/>
+              <w:spacing w:after="20"/>
+            </w:pPr>
+            <w:r>
+              <w:rPr>
+                <w:b w:val="false"/>
+                <w:bCs w:val="false"/>
+                <w:sz w:val="21"/>
+                <w:szCs w:val="21"/>
               </w:rPr>
               <w:t xml:space="preserve">グローバルコース（約20名）：英語圏の高校へ3か月〜1年の留学が原則必修。入試は英語＋面接</w:t>
             </w:r>
@@ -3961,14 +3955,14 @@
           </w:tcPr>
           <w:p>
             <w:pPr>
-              <w:spacing w:after="20" w:line="260"/>
-            </w:pPr>
-            <w:r>
-              <w:rPr>
-                <w:b w:val="false"/>
-                <w:bCs w:val="false"/>
-                <w:sz w:val="17"/>
-                <w:szCs w:val="17"/>
+              <w:spacing w:after="20"/>
+            </w:pPr>
+            <w:r>
+              <w:rPr>
+                <w:b w:val="false"/>
+                <w:bCs w:val="false"/>
+                <w:sz w:val="21"/>
+                <w:szCs w:val="21"/>
               </w:rPr>
               <w:t xml:space="preserve">校風</w:t>
             </w:r>
@@ -3992,14 +3986,14 @@
           </w:tcPr>
           <w:p>
             <w:pPr>
-              <w:spacing w:after="20" w:line="260"/>
-            </w:pPr>
-            <w:r>
-              <w:rPr>
-                <w:b w:val="false"/>
-                <w:bCs w:val="false"/>
-                <w:sz w:val="17"/>
-                <w:szCs w:val="17"/>
+              <w:spacing w:after="20"/>
+            </w:pPr>
+            <w:r>
+              <w:rPr>
+                <w:b w:val="false"/>
+                <w:bCs w:val="false"/>
+                <w:sz w:val="21"/>
+                <w:szCs w:val="21"/>
               </w:rPr>
               <w:t xml:space="preserve">1887年創立、神戸で最も古い女子校。校訓「誠実」「堅忍不抜」「忠恕温和」。落ち着いた伝統校で面倒見の良さに定評</w:t>
             </w:r>
@@ -4026,14 +4020,14 @@
           </w:tcPr>
           <w:p>
             <w:pPr>
-              <w:spacing w:after="20" w:line="260"/>
-            </w:pPr>
-            <w:r>
-              <w:rPr>
-                <w:b w:val="false"/>
-                <w:bCs w:val="false"/>
-                <w:sz w:val="17"/>
-                <w:szCs w:val="17"/>
+              <w:spacing w:after="20"/>
+            </w:pPr>
+            <w:r>
+              <w:rPr>
+                <w:b w:val="false"/>
+                <w:bCs w:val="false"/>
+                <w:sz w:val="21"/>
+                <w:szCs w:val="21"/>
               </w:rPr>
               <w:t xml:space="preserve">大学との関係</w:t>
             </w:r>
@@ -4057,14 +4051,14 @@
           </w:tcPr>
           <w:p>
             <w:pPr>
-              <w:spacing w:after="20" w:line="260"/>
-            </w:pPr>
-            <w:r>
-              <w:rPr>
-                <w:b w:val="false"/>
-                <w:bCs w:val="false"/>
-                <w:sz w:val="17"/>
-                <w:szCs w:val="17"/>
+              <w:spacing w:after="20"/>
+            </w:pPr>
+            <w:r>
+              <w:rPr>
+                <w:b w:val="false"/>
+                <w:bCs w:val="false"/>
+                <w:sz w:val="21"/>
+                <w:szCs w:val="21"/>
               </w:rPr>
               <w:t xml:space="preserve">神戸親和大学（2023年に共学化）への接続あり。特に教育学部（教員・保育士志望）とつながりが強い</w:t>
             </w:r>
@@ -4123,14 +4117,14 @@
           </w:tcPr>
           <w:p>
             <w:pPr>
-              <w:spacing w:after="20" w:line="260"/>
-            </w:pPr>
-            <w:r>
-              <w:rPr>
-                <w:b w:val="false"/>
-                <w:bCs w:val="false"/>
-                <w:sz w:val="17"/>
-                <w:szCs w:val="17"/>
+              <w:spacing w:after="20"/>
+            </w:pPr>
+            <w:r>
+              <w:rPr>
+                <w:b w:val="false"/>
+                <w:bCs w:val="false"/>
+                <w:sz w:val="21"/>
+                <w:szCs w:val="21"/>
               </w:rPr>
               <w:t xml:space="preserve">5月</w:t>
             </w:r>
@@ -4154,14 +4148,14 @@
           </w:tcPr>
           <w:p>
             <w:pPr>
-              <w:spacing w:after="20" w:line="260"/>
-            </w:pPr>
-            <w:r>
-              <w:rPr>
-                <w:b w:val="false"/>
-                <w:bCs w:val="false"/>
-                <w:sz w:val="17"/>
-                <w:szCs w:val="17"/>
+              <w:spacing w:after="20"/>
+            </w:pPr>
+            <w:r>
+              <w:rPr>
+                <w:b w:val="false"/>
+                <w:bCs w:val="false"/>
+                <w:sz w:val="21"/>
+                <w:szCs w:val="21"/>
               </w:rPr>
               <w:t xml:space="preserve">文化祭（生徒会「親友会」主催の一大行事）</w:t>
             </w:r>
@@ -4188,14 +4182,14 @@
           </w:tcPr>
           <w:p>
             <w:pPr>
-              <w:spacing w:after="20" w:line="260"/>
-            </w:pPr>
-            <w:r>
-              <w:rPr>
-                <w:b w:val="false"/>
-                <w:bCs w:val="false"/>
-                <w:sz w:val="17"/>
-                <w:szCs w:val="17"/>
+              <w:spacing w:after="20"/>
+            </w:pPr>
+            <w:r>
+              <w:rPr>
+                <w:b w:val="false"/>
+                <w:bCs w:val="false"/>
+                <w:sz w:val="21"/>
+                <w:szCs w:val="21"/>
               </w:rPr>
               <w:t xml:space="preserve">6月</w:t>
             </w:r>
@@ -4219,14 +4213,14 @@
           </w:tcPr>
           <w:p>
             <w:pPr>
-              <w:spacing w:after="20" w:line="260"/>
-            </w:pPr>
-            <w:r>
-              <w:rPr>
-                <w:b w:val="false"/>
-                <w:bCs w:val="false"/>
-                <w:sz w:val="17"/>
-                <w:szCs w:val="17"/>
+              <w:spacing w:after="20"/>
+            </w:pPr>
+            <w:r>
+              <w:rPr>
+                <w:b w:val="false"/>
+                <w:bCs w:val="false"/>
+                <w:sz w:val="21"/>
+                <w:szCs w:val="21"/>
               </w:rPr>
               <w:t xml:space="preserve">体育祭（中1〜高3の合同）。高3のダンス「カレドニアン」・「カドリーユ」が名物の伝統行事</w:t>
             </w:r>
@@ -4253,14 +4247,14 @@
           </w:tcPr>
           <w:p>
             <w:pPr>
-              <w:spacing w:after="20" w:line="260"/>
-            </w:pPr>
-            <w:r>
-              <w:rPr>
-                <w:b w:val="false"/>
-                <w:bCs w:val="false"/>
-                <w:sz w:val="17"/>
-                <w:szCs w:val="17"/>
+              <w:spacing w:after="20"/>
+            </w:pPr>
+            <w:r>
+              <w:rPr>
+                <w:b w:val="false"/>
+                <w:bCs w:val="false"/>
+                <w:sz w:val="21"/>
+                <w:szCs w:val="21"/>
               </w:rPr>
               <w:t xml:space="preserve">7月</w:t>
             </w:r>
@@ -4284,14 +4278,14 @@
           </w:tcPr>
           <w:p>
             <w:pPr>
-              <w:spacing w:after="20" w:line="260"/>
-            </w:pPr>
-            <w:r>
-              <w:rPr>
-                <w:b w:val="false"/>
-                <w:bCs w:val="false"/>
-                <w:sz w:val="17"/>
-                <w:szCs w:val="17"/>
+              <w:spacing w:after="20"/>
+            </w:pPr>
+            <w:r>
+              <w:rPr>
+                <w:b w:val="false"/>
+                <w:bCs w:val="false"/>
+                <w:sz w:val="21"/>
+                <w:szCs w:val="21"/>
               </w:rPr>
               <w:t xml:space="preserve">球技大会（クラス対抗）</w:t>
             </w:r>
@@ -4318,14 +4312,14 @@
           </w:tcPr>
           <w:p>
             <w:pPr>
-              <w:spacing w:after="20" w:line="260"/>
-            </w:pPr>
-            <w:r>
-              <w:rPr>
-                <w:b w:val="false"/>
-                <w:bCs w:val="false"/>
-                <w:sz w:val="17"/>
-                <w:szCs w:val="17"/>
+              <w:spacing w:after="20"/>
+            </w:pPr>
+            <w:r>
+              <w:rPr>
+                <w:b w:val="false"/>
+                <w:bCs w:val="false"/>
+                <w:sz w:val="21"/>
+                <w:szCs w:val="21"/>
               </w:rPr>
               <w:t xml:space="preserve">10月</w:t>
             </w:r>
@@ -4349,14 +4343,14 @@
           </w:tcPr>
           <w:p>
             <w:pPr>
-              <w:spacing w:after="20" w:line="260"/>
-            </w:pPr>
-            <w:r>
-              <w:rPr>
-                <w:b w:val="false"/>
-                <w:bCs w:val="false"/>
-                <w:sz w:val="17"/>
-                <w:szCs w:val="17"/>
+              <w:spacing w:after="20"/>
+            </w:pPr>
+            <w:r>
+              <w:rPr>
+                <w:b w:val="false"/>
+                <w:bCs w:val="false"/>
+                <w:sz w:val="21"/>
+                <w:szCs w:val="21"/>
               </w:rPr>
               <w:t xml:space="preserve">高2研修旅行／10月26日 校祖記念日の追弔会</w:t>
             </w:r>
@@ -4383,14 +4377,14 @@
           </w:tcPr>
           <w:p>
             <w:pPr>
-              <w:spacing w:after="20" w:line="260"/>
-            </w:pPr>
-            <w:r>
-              <w:rPr>
-                <w:b w:val="false"/>
-                <w:bCs w:val="false"/>
-                <w:sz w:val="17"/>
-                <w:szCs w:val="17"/>
+              <w:spacing w:after="20"/>
+            </w:pPr>
+            <w:r>
+              <w:rPr>
+                <w:b w:val="false"/>
+                <w:bCs w:val="false"/>
+                <w:sz w:val="21"/>
+                <w:szCs w:val="21"/>
               </w:rPr>
               <w:t xml:space="preserve">その他</w:t>
             </w:r>
@@ -4414,14 +4408,14 @@
           </w:tcPr>
           <w:p>
             <w:pPr>
-              <w:spacing w:after="20" w:line="260"/>
-            </w:pPr>
-            <w:r>
-              <w:rPr>
-                <w:b w:val="false"/>
-                <w:bCs w:val="false"/>
-                <w:sz w:val="17"/>
-                <w:szCs w:val="17"/>
+              <w:spacing w:after="20"/>
+            </w:pPr>
+            <w:r>
+              <w:rPr>
+                <w:b w:val="false"/>
+                <w:bCs w:val="false"/>
+                <w:sz w:val="21"/>
+                <w:szCs w:val="21"/>
               </w:rPr>
               <w:t xml:space="preserve">音楽会、演劇鑑賞、海外研修・ホームステイ</w:t>
             </w:r>
@@ -4478,13 +4472,10 @@
             </w:tcMar>
           </w:tcPr>
           <w:p>
-            <w:pPr>
-              <w:spacing w:line="290"/>
-            </w:pPr>
-            <w:r>
-              <w:rPr>
-                <w:sz w:val="19"/>
-                <w:szCs w:val="19"/>
+            <w:r>
+              <w:rPr>
+                <w:sz w:val="21"/>
+                <w:szCs w:val="21"/>
               </w:rPr>
               <w:t xml:space="preserve">伝統ある女子校で、少人数・面倒見重視。本格的な長期留学（グローバルコース）や、教員・保育士志望なら特に相性が良い。六甲からの坂道通学は見学時に必ず体験を。</w:t>
             </w:r>
@@ -4541,14 +4532,14 @@
           </w:tcPr>
           <w:p>
             <w:pPr>
-              <w:spacing w:after="20" w:line="260"/>
-            </w:pPr>
-            <w:r>
-              <w:rPr>
-                <w:b w:val="false"/>
-                <w:bCs w:val="false"/>
-                <w:sz w:val="17"/>
-                <w:szCs w:val="17"/>
+              <w:spacing w:after="20"/>
+            </w:pPr>
+            <w:r>
+              <w:rPr>
+                <w:b w:val="false"/>
+                <w:bCs w:val="false"/>
+                <w:sz w:val="21"/>
+                <w:szCs w:val="21"/>
               </w:rPr>
               <w:t xml:space="preserve">所在地</w:t>
             </w:r>
@@ -4572,14 +4563,14 @@
           </w:tcPr>
           <w:p>
             <w:pPr>
-              <w:spacing w:after="20" w:line="260"/>
-            </w:pPr>
-            <w:r>
-              <w:rPr>
-                <w:b w:val="false"/>
-                <w:bCs w:val="false"/>
-                <w:sz w:val="17"/>
-                <w:szCs w:val="17"/>
+              <w:spacing w:after="20"/>
+            </w:pPr>
+            <w:r>
+              <w:rPr>
+                <w:b w:val="false"/>
+                <w:bCs w:val="false"/>
+                <w:sz w:val="21"/>
+                <w:szCs w:val="21"/>
               </w:rPr>
               <w:t xml:space="preserve">神戸市中央区中島通5-3-1（新神戸駅の東側の山手）</w:t>
             </w:r>
@@ -4606,14 +4597,14 @@
           </w:tcPr>
           <w:p>
             <w:pPr>
-              <w:spacing w:after="20" w:line="260"/>
-            </w:pPr>
-            <w:r>
-              <w:rPr>
-                <w:b w:val="false"/>
-                <w:bCs w:val="false"/>
-                <w:sz w:val="17"/>
-                <w:szCs w:val="17"/>
+              <w:spacing w:after="20"/>
+            </w:pPr>
+            <w:r>
+              <w:rPr>
+                <w:b w:val="false"/>
+                <w:bCs w:val="false"/>
+                <w:sz w:val="21"/>
+                <w:szCs w:val="21"/>
               </w:rPr>
               <w:t xml:space="preserve">最寄り駅</w:t>
             </w:r>
@@ -4637,14 +4628,14 @@
           </w:tcPr>
           <w:p>
             <w:pPr>
-              <w:spacing w:after="20" w:line="260"/>
-            </w:pPr>
-            <w:r>
-              <w:rPr>
-                <w:b w:val="false"/>
-                <w:bCs w:val="false"/>
-                <w:sz w:val="17"/>
-                <w:szCs w:val="17"/>
+              <w:spacing w:after="20"/>
+            </w:pPr>
+            <w:r>
+              <w:rPr>
+                <w:b w:val="false"/>
+                <w:bCs w:val="false"/>
+                <w:sz w:val="21"/>
+                <w:szCs w:val="21"/>
               </w:rPr>
               <w:t xml:space="preserve">地下鉄「新神戸」駅 徒歩約15分／三宮・阪急六甲から市バス2系統・18系統「青谷」下車 徒歩約5分／阪急「王子公園」・阪神「春日野道」からも徒歩圏（15分前後）</w:t>
             </w:r>
@@ -4671,14 +4662,14 @@
           </w:tcPr>
           <w:p>
             <w:pPr>
-              <w:spacing w:after="20" w:line="260"/>
-            </w:pPr>
-            <w:r>
-              <w:rPr>
-                <w:b w:val="false"/>
-                <w:bCs w:val="false"/>
-                <w:sz w:val="17"/>
-                <w:szCs w:val="17"/>
+              <w:spacing w:after="20"/>
+            </w:pPr>
+            <w:r>
+              <w:rPr>
+                <w:b w:val="false"/>
+                <w:bCs w:val="false"/>
+                <w:sz w:val="21"/>
+                <w:szCs w:val="21"/>
               </w:rPr>
               <w:t xml:space="preserve">男女</w:t>
             </w:r>
@@ -4702,14 +4693,14 @@
           </w:tcPr>
           <w:p>
             <w:pPr>
-              <w:spacing w:after="20" w:line="260"/>
-            </w:pPr>
-            <w:r>
-              <w:rPr>
-                <w:b w:val="false"/>
-                <w:bCs w:val="false"/>
-                <w:sz w:val="17"/>
-                <w:szCs w:val="17"/>
+              <w:spacing w:after="20"/>
+            </w:pPr>
+            <w:r>
+              <w:rPr>
+                <w:b w:val="false"/>
+                <w:bCs w:val="false"/>
+                <w:sz w:val="21"/>
+                <w:szCs w:val="21"/>
               </w:rPr>
               <w:t xml:space="preserve">男女共学（もとは女子校）</w:t>
             </w:r>
@@ -4736,14 +4727,14 @@
           </w:tcPr>
           <w:p>
             <w:pPr>
-              <w:spacing w:after="20" w:line="260"/>
-            </w:pPr>
-            <w:r>
-              <w:rPr>
-                <w:b w:val="false"/>
-                <w:bCs w:val="false"/>
-                <w:sz w:val="17"/>
-                <w:szCs w:val="17"/>
+              <w:spacing w:after="20"/>
+            </w:pPr>
+            <w:r>
+              <w:rPr>
+                <w:b w:val="false"/>
+                <w:bCs w:val="false"/>
+                <w:sz w:val="21"/>
+                <w:szCs w:val="21"/>
               </w:rPr>
               <w:t xml:space="preserve">コース（2026年度）</w:t>
             </w:r>
@@ -4767,56 +4758,56 @@
           </w:tcPr>
           <w:p>
             <w:pPr>
-              <w:spacing w:after="20" w:line="260"/>
-            </w:pPr>
-            <w:r>
-              <w:rPr>
-                <w:b w:val="false"/>
-                <w:bCs w:val="false"/>
-                <w:sz w:val="17"/>
-                <w:szCs w:val="17"/>
+              <w:spacing w:after="20"/>
+            </w:pPr>
+            <w:r>
+              <w:rPr>
+                <w:b w:val="false"/>
+                <w:bCs w:val="false"/>
+                <w:sz w:val="21"/>
+                <w:szCs w:val="21"/>
               </w:rPr>
               <w:t xml:space="preserve">医療理数コース（20名）：医歯薬・理工系の国公立を目指す。企業連携・PBL型授業</w:t>
             </w:r>
           </w:p>
           <w:p>
             <w:pPr>
-              <w:spacing w:after="20" w:line="260"/>
-            </w:pPr>
-            <w:r>
-              <w:rPr>
-                <w:b w:val="false"/>
-                <w:bCs w:val="false"/>
-                <w:sz w:val="17"/>
-                <w:szCs w:val="17"/>
+              <w:spacing w:after="20"/>
+            </w:pPr>
+            <w:r>
+              <w:rPr>
+                <w:b w:val="false"/>
+                <w:bCs w:val="false"/>
+                <w:sz w:val="21"/>
+                <w:szCs w:val="21"/>
               </w:rPr>
               <w:t xml:space="preserve">国際教養コース（40名）：海外大学・国公立文系・語学系私大。海外研修あり</w:t>
             </w:r>
           </w:p>
           <w:p>
             <w:pPr>
-              <w:spacing w:after="20" w:line="260"/>
-            </w:pPr>
-            <w:r>
-              <w:rPr>
-                <w:b w:val="false"/>
-                <w:bCs w:val="false"/>
-                <w:sz w:val="17"/>
-                <w:szCs w:val="17"/>
+              <w:spacing w:after="20"/>
+            </w:pPr>
+            <w:r>
+              <w:rPr>
+                <w:b w:val="false"/>
+                <w:bCs w:val="false"/>
+                <w:sz w:val="21"/>
+                <w:szCs w:val="21"/>
               </w:rPr>
               <w:t xml:space="preserve">難関進学コース（80名）：文理共通探究講座・大学連携。国公立・難関私大</w:t>
             </w:r>
           </w:p>
           <w:p>
             <w:pPr>
-              <w:spacing w:after="20" w:line="260"/>
-            </w:pPr>
-            <w:r>
-              <w:rPr>
-                <w:b w:val="false"/>
-                <w:bCs w:val="false"/>
-                <w:sz w:val="17"/>
-                <w:szCs w:val="17"/>
+              <w:spacing w:after="20"/>
+            </w:pPr>
+            <w:r>
+              <w:rPr>
+                <w:b w:val="false"/>
+                <w:bCs w:val="false"/>
+                <w:sz w:val="21"/>
+                <w:szCs w:val="21"/>
               </w:rPr>
               <w:t xml:space="preserve">総合進学コース（120名）：私大中心。推薦・一般の両方に対応</w:t>
             </w:r>
@@ -4843,14 +4834,14 @@
           </w:tcPr>
           <w:p>
             <w:pPr>
-              <w:spacing w:after="20" w:line="260"/>
-            </w:pPr>
-            <w:r>
-              <w:rPr>
-                <w:b w:val="false"/>
-                <w:bCs w:val="false"/>
-                <w:sz w:val="17"/>
-                <w:szCs w:val="17"/>
+              <w:spacing w:after="20"/>
+            </w:pPr>
+            <w:r>
+              <w:rPr>
+                <w:b w:val="false"/>
+                <w:bCs w:val="false"/>
+                <w:sz w:val="21"/>
+                <w:szCs w:val="21"/>
               </w:rPr>
               <w:t xml:space="preserve">校風</w:t>
             </w:r>
@@ -4874,14 +4865,14 @@
           </w:tcPr>
           <w:p>
             <w:pPr>
-              <w:spacing w:after="20" w:line="260"/>
-            </w:pPr>
-            <w:r>
-              <w:rPr>
-                <w:b w:val="false"/>
-                <w:bCs w:val="false"/>
-                <w:sz w:val="17"/>
-                <w:szCs w:val="17"/>
+              <w:spacing w:after="20"/>
+            </w:pPr>
+            <w:r>
+              <w:rPr>
+                <w:b w:val="false"/>
+                <w:bCs w:val="false"/>
+                <w:sz w:val="21"/>
+                <w:szCs w:val="21"/>
               </w:rPr>
               <w:t xml:space="preserve">浄土真宗本願寺派の宗門校。仏教の教えをもとにした「心の教育」。龍谷大学などとの連携あり。共学化後、コース改編で進学指導を強化中</w:t>
             </w:r>
@@ -4908,14 +4899,14 @@
           </w:tcPr>
           <w:p>
             <w:pPr>
-              <w:spacing w:after="20" w:line="260"/>
-            </w:pPr>
-            <w:r>
-              <w:rPr>
-                <w:b w:val="false"/>
-                <w:bCs w:val="false"/>
-                <w:sz w:val="17"/>
-                <w:szCs w:val="17"/>
+              <w:spacing w:after="20"/>
+            </w:pPr>
+            <w:r>
+              <w:rPr>
+                <w:b w:val="false"/>
+                <w:bCs w:val="false"/>
+                <w:sz w:val="21"/>
+                <w:szCs w:val="21"/>
               </w:rPr>
               <w:t xml:space="preserve">大学との関係</w:t>
             </w:r>
@@ -4939,14 +4930,14 @@
           </w:tcPr>
           <w:p>
             <w:pPr>
-              <w:spacing w:after="20" w:line="260"/>
-            </w:pPr>
-            <w:r>
-              <w:rPr>
-                <w:b w:val="false"/>
-                <w:bCs w:val="false"/>
-                <w:sz w:val="17"/>
-                <w:szCs w:val="17"/>
+              <w:spacing w:after="20"/>
+            </w:pPr>
+            <w:r>
+              <w:rPr>
+                <w:b w:val="false"/>
+                <w:bCs w:val="false"/>
+                <w:sz w:val="21"/>
+                <w:szCs w:val="21"/>
               </w:rPr>
               <w:t xml:space="preserve">龍谷大学など関係大学への推薦枠あり（詳細は説明会で要確認）</w:t>
             </w:r>
@@ -4973,14 +4964,14 @@
           </w:tcPr>
           <w:p>
             <w:pPr>
-              <w:spacing w:after="20" w:line="260"/>
-            </w:pPr>
-            <w:r>
-              <w:rPr>
-                <w:b w:val="false"/>
-                <w:bCs w:val="false"/>
-                <w:sz w:val="17"/>
-                <w:szCs w:val="17"/>
+              <w:spacing w:after="20"/>
+            </w:pPr>
+            <w:r>
+              <w:rPr>
+                <w:b w:val="false"/>
+                <w:bCs w:val="false"/>
+                <w:sz w:val="21"/>
+                <w:szCs w:val="21"/>
               </w:rPr>
               <w:t xml:space="preserve">制服</w:t>
             </w:r>
@@ -5004,14 +4995,14 @@
           </w:tcPr>
           <w:p>
             <w:pPr>
-              <w:spacing w:after="20" w:line="260"/>
-            </w:pPr>
-            <w:r>
-              <w:rPr>
-                <w:b w:val="false"/>
-                <w:bCs w:val="false"/>
-                <w:sz w:val="17"/>
-                <w:szCs w:val="17"/>
+              <w:spacing w:after="20"/>
+            </w:pPr>
+            <w:r>
+              <w:rPr>
+                <w:b w:val="false"/>
+                <w:bCs w:val="false"/>
+                <w:sz w:val="21"/>
+                <w:szCs w:val="21"/>
               </w:rPr>
               <w:t xml:space="preserve">夏・冬・合服あり。女子はスカート／スラックス選択可。制靴・制鞄の指定なし</w:t>
             </w:r>
@@ -5070,14 +5061,14 @@
           </w:tcPr>
           <w:p>
             <w:pPr>
-              <w:spacing w:after="20" w:line="260"/>
-            </w:pPr>
-            <w:r>
-              <w:rPr>
-                <w:b w:val="false"/>
-                <w:bCs w:val="false"/>
-                <w:sz w:val="17"/>
-                <w:szCs w:val="17"/>
+              <w:spacing w:after="20"/>
+            </w:pPr>
+            <w:r>
+              <w:rPr>
+                <w:b w:val="false"/>
+                <w:bCs w:val="false"/>
+                <w:sz w:val="21"/>
+                <w:szCs w:val="21"/>
               </w:rPr>
               <w:t xml:space="preserve">6月</w:t>
             </w:r>
@@ -5101,14 +5092,14 @@
           </w:tcPr>
           <w:p>
             <w:pPr>
-              <w:spacing w:after="20" w:line="260"/>
-            </w:pPr>
-            <w:r>
-              <w:rPr>
-                <w:b w:val="false"/>
-                <w:bCs w:val="false"/>
-                <w:sz w:val="17"/>
-                <w:szCs w:val="17"/>
+              <w:spacing w:after="20"/>
+            </w:pPr>
+            <w:r>
+              <w:rPr>
+                <w:b w:val="false"/>
+                <w:bCs w:val="false"/>
+                <w:sz w:val="21"/>
+                <w:szCs w:val="21"/>
               </w:rPr>
               <w:t xml:space="preserve">神龍祭（文化祭・一般公開）：クラス展示・ステージ発表・模擬店</w:t>
             </w:r>
@@ -5135,14 +5126,14 @@
           </w:tcPr>
           <w:p>
             <w:pPr>
-              <w:spacing w:after="20" w:line="260"/>
-            </w:pPr>
-            <w:r>
-              <w:rPr>
-                <w:b w:val="false"/>
-                <w:bCs w:val="false"/>
-                <w:sz w:val="17"/>
-                <w:szCs w:val="17"/>
+              <w:spacing w:after="20"/>
+            </w:pPr>
+            <w:r>
+              <w:rPr>
+                <w:b w:val="false"/>
+                <w:bCs w:val="false"/>
+                <w:sz w:val="21"/>
+                <w:szCs w:val="21"/>
               </w:rPr>
               <w:t xml:space="preserve">10月</w:t>
             </w:r>
@@ -5166,14 +5157,14 @@
           </w:tcPr>
           <w:p>
             <w:pPr>
-              <w:spacing w:after="20" w:line="260"/>
-            </w:pPr>
-            <w:r>
-              <w:rPr>
-                <w:b w:val="false"/>
-                <w:bCs w:val="false"/>
-                <w:sz w:val="17"/>
-                <w:szCs w:val="17"/>
+              <w:spacing w:after="20"/>
+            </w:pPr>
+            <w:r>
+              <w:rPr>
+                <w:b w:val="false"/>
+                <w:bCs w:val="false"/>
+                <w:sz w:val="21"/>
+                <w:szCs w:val="21"/>
               </w:rPr>
               <w:t xml:space="preserve">体育大会（リレー・3人4脚など）</w:t>
             </w:r>
@@ -5200,14 +5191,14 @@
           </w:tcPr>
           <w:p>
             <w:pPr>
-              <w:spacing w:after="20" w:line="260"/>
-            </w:pPr>
-            <w:r>
-              <w:rPr>
-                <w:b w:val="false"/>
-                <w:bCs w:val="false"/>
-                <w:sz w:val="17"/>
-                <w:szCs w:val="17"/>
+              <w:spacing w:after="20"/>
+            </w:pPr>
+            <w:r>
+              <w:rPr>
+                <w:b w:val="false"/>
+                <w:bCs w:val="false"/>
+                <w:sz w:val="21"/>
+                <w:szCs w:val="21"/>
               </w:rPr>
               <w:t xml:space="preserve">1年生</w:t>
             </w:r>
@@ -5231,14 +5222,14 @@
           </w:tcPr>
           <w:p>
             <w:pPr>
-              <w:spacing w:after="20" w:line="260"/>
-            </w:pPr>
-            <w:r>
-              <w:rPr>
-                <w:b w:val="false"/>
-                <w:bCs w:val="false"/>
-                <w:sz w:val="17"/>
-                <w:szCs w:val="17"/>
+              <w:spacing w:after="20"/>
+            </w:pPr>
+            <w:r>
+              <w:rPr>
+                <w:b w:val="false"/>
+                <w:bCs w:val="false"/>
+                <w:sz w:val="21"/>
+                <w:szCs w:val="21"/>
               </w:rPr>
               <w:t xml:space="preserve">比叡山研修など仏教系ならではの行事</w:t>
             </w:r>
@@ -5265,14 +5256,14 @@
           </w:tcPr>
           <w:p>
             <w:pPr>
-              <w:spacing w:after="20" w:line="260"/>
-            </w:pPr>
-            <w:r>
-              <w:rPr>
-                <w:b w:val="false"/>
-                <w:bCs w:val="false"/>
-                <w:sz w:val="17"/>
-                <w:szCs w:val="17"/>
+              <w:spacing w:after="20"/>
+            </w:pPr>
+            <w:r>
+              <w:rPr>
+                <w:b w:val="false"/>
+                <w:bCs w:val="false"/>
+                <w:sz w:val="21"/>
+                <w:szCs w:val="21"/>
               </w:rPr>
               <w:t xml:space="preserve">その他</w:t>
             </w:r>
@@ -5296,14 +5287,14 @@
           </w:tcPr>
           <w:p>
             <w:pPr>
-              <w:spacing w:after="20" w:line="260"/>
-            </w:pPr>
-            <w:r>
-              <w:rPr>
-                <w:b w:val="false"/>
-                <w:bCs w:val="false"/>
-                <w:sz w:val="17"/>
-                <w:szCs w:val="17"/>
+              <w:spacing w:after="20"/>
+            </w:pPr>
+            <w:r>
+              <w:rPr>
+                <w:b w:val="false"/>
+                <w:bCs w:val="false"/>
+                <w:sz w:val="21"/>
+                <w:szCs w:val="21"/>
               </w:rPr>
               <w:t xml:space="preserve">短期留学・海外研修、修学旅行（コースにより行先が異なる。例：医療理数は東京）</w:t>
             </w:r>
@@ -5360,13 +5351,10 @@
             </w:tcMar>
           </w:tcPr>
           <w:p>
-            <w:pPr>
-              <w:spacing w:line="290"/>
-            </w:pPr>
-            <w:r>
-              <w:rPr>
-                <w:sz w:val="19"/>
-                <w:szCs w:val="19"/>
+            <w:r>
+              <w:rPr>
+                <w:sz w:val="21"/>
+                <w:szCs w:val="21"/>
               </w:rPr>
               <w:t xml:space="preserve">目的別にコースが細かく分かれているのが特徴。「医療系に進みたい」なら医療理数コースが明確な選択肢。共学で、制服のスラックス選択など自由度も比較的高い。</w:t>
             </w:r>
@@ -5426,15 +5414,15 @@
           </w:tcPr>
           <w:p>
             <w:pPr>
-              <w:spacing w:after="20" w:line="260"/>
+              <w:spacing w:after="20"/>
             </w:pPr>
             <w:r>
               <w:rPr>
                 <w:b/>
                 <w:bCs/>
                 <w:color w:val="FFFFFF"/>
-                <w:sz w:val="17"/>
-                <w:szCs w:val="17"/>
+                <w:sz w:val="21"/>
+                <w:szCs w:val="21"/>
               </w:rPr>
               <w:t xml:space="preserve">こんな希望があるなら</w:t>
             </w:r>
@@ -5459,15 +5447,15 @@
           </w:tcPr>
           <w:p>
             <w:pPr>
-              <w:spacing w:after="20" w:line="260"/>
+              <w:spacing w:after="20"/>
             </w:pPr>
             <w:r>
               <w:rPr>
                 <w:b/>
                 <w:bCs/>
                 <w:color w:val="FFFFFF"/>
-                <w:sz w:val="17"/>
-                <w:szCs w:val="17"/>
+                <w:sz w:val="21"/>
+                <w:szCs w:val="21"/>
               </w:rPr>
               <w:t xml:space="preserve">検討の中心になる学校</w:t>
             </w:r>
@@ -5497,14 +5485,14 @@
           </w:tcPr>
           <w:p>
             <w:pPr>
-              <w:spacing w:after="20" w:line="260"/>
-            </w:pPr>
-            <w:r>
-              <w:rPr>
-                <w:b w:val="false"/>
-                <w:bCs w:val="false"/>
-                <w:sz w:val="17"/>
-                <w:szCs w:val="17"/>
+              <w:spacing w:after="20"/>
+            </w:pPr>
+            <w:r>
+              <w:rPr>
+                <w:b w:val="false"/>
+                <w:bCs w:val="false"/>
+                <w:sz w:val="21"/>
+                <w:szCs w:val="21"/>
               </w:rPr>
               <w:t xml:space="preserve">国公立・難関私大を本気で目指したい</w:t>
             </w:r>
@@ -5528,14 +5516,14 @@
           </w:tcPr>
           <w:p>
             <w:pPr>
-              <w:spacing w:after="20" w:line="260"/>
-            </w:pPr>
-            <w:r>
-              <w:rPr>
-                <w:b w:val="false"/>
-                <w:bCs w:val="false"/>
-                <w:sz w:val="17"/>
-                <w:szCs w:val="17"/>
+              <w:spacing w:after="20"/>
+            </w:pPr>
+            <w:r>
+              <w:rPr>
+                <w:b w:val="false"/>
+                <w:bCs w:val="false"/>
+                <w:sz w:val="21"/>
+                <w:szCs w:val="21"/>
               </w:rPr>
               <w:t xml:space="preserve">神戸学院附属（特進文理）、神戸龍谷（難関進学）、親和（アドバンスト）</w:t>
             </w:r>
@@ -5565,14 +5553,14 @@
           </w:tcPr>
           <w:p>
             <w:pPr>
-              <w:spacing w:after="20" w:line="260"/>
-            </w:pPr>
-            <w:r>
-              <w:rPr>
-                <w:b w:val="false"/>
-                <w:bCs w:val="false"/>
-                <w:sz w:val="17"/>
-                <w:szCs w:val="17"/>
+              <w:spacing w:after="20"/>
+            </w:pPr>
+            <w:r>
+              <w:rPr>
+                <w:b w:val="false"/>
+                <w:bCs w:val="false"/>
+                <w:sz w:val="21"/>
+                <w:szCs w:val="21"/>
               </w:rPr>
               <w:t xml:space="preserve">医療系（医・歯・薬・看護）に進みたい</w:t>
             </w:r>
@@ -5596,14 +5584,14 @@
           </w:tcPr>
           <w:p>
             <w:pPr>
-              <w:spacing w:after="20" w:line="260"/>
-            </w:pPr>
-            <w:r>
-              <w:rPr>
-                <w:b w:val="false"/>
-                <w:bCs w:val="false"/>
-                <w:sz w:val="17"/>
-                <w:szCs w:val="17"/>
+              <w:spacing w:after="20"/>
+            </w:pPr>
+            <w:r>
+              <w:rPr>
+                <w:b w:val="false"/>
+                <w:bCs w:val="false"/>
+                <w:sz w:val="21"/>
+                <w:szCs w:val="21"/>
               </w:rPr>
               <w:t xml:space="preserve">神戸龍谷（医療理数）、武庫川女子附属（GS／内部推薦で薬・看護）</w:t>
             </w:r>
@@ -5633,14 +5621,14 @@
           </w:tcPr>
           <w:p>
             <w:pPr>
-              <w:spacing w:after="20" w:line="260"/>
-            </w:pPr>
-            <w:r>
-              <w:rPr>
-                <w:b w:val="false"/>
-                <w:bCs w:val="false"/>
-                <w:sz w:val="17"/>
-                <w:szCs w:val="17"/>
+              <w:spacing w:after="20"/>
+            </w:pPr>
+            <w:r>
+              <w:rPr>
+                <w:b w:val="false"/>
+                <w:bCs w:val="false"/>
+                <w:sz w:val="21"/>
+                <w:szCs w:val="21"/>
               </w:rPr>
               <w:t xml:space="preserve">看護・栄養・教育などの資格を大学で確実に取りたい</w:t>
             </w:r>
@@ -5664,14 +5652,14 @@
           </w:tcPr>
           <w:p>
             <w:pPr>
-              <w:spacing w:after="20" w:line="260"/>
-            </w:pPr>
-            <w:r>
-              <w:rPr>
-                <w:b w:val="false"/>
-                <w:bCs w:val="false"/>
-                <w:sz w:val="17"/>
-                <w:szCs w:val="17"/>
+              <w:spacing w:after="20"/>
+            </w:pPr>
+            <w:r>
+              <w:rPr>
+                <w:b w:val="false"/>
+                <w:bCs w:val="false"/>
+                <w:sz w:val="21"/>
+                <w:szCs w:val="21"/>
               </w:rPr>
               <w:t xml:space="preserve">武庫川女子附属（内部推薦が強い）</w:t>
             </w:r>
@@ -5701,14 +5689,14 @@
           </w:tcPr>
           <w:p>
             <w:pPr>
-              <w:spacing w:after="20" w:line="260"/>
-            </w:pPr>
-            <w:r>
-              <w:rPr>
-                <w:b w:val="false"/>
-                <w:bCs w:val="false"/>
-                <w:sz w:val="17"/>
-                <w:szCs w:val="17"/>
+              <w:spacing w:after="20"/>
+            </w:pPr>
+            <w:r>
+              <w:rPr>
+                <w:b w:val="false"/>
+                <w:bCs w:val="false"/>
+                <w:sz w:val="21"/>
+                <w:szCs w:val="21"/>
               </w:rPr>
               <w:t xml:space="preserve">英語・留学・海外に興味がある</w:t>
             </w:r>
@@ -5732,14 +5720,14 @@
           </w:tcPr>
           <w:p>
             <w:pPr>
-              <w:spacing w:after="20" w:line="260"/>
-            </w:pPr>
-            <w:r>
-              <w:rPr>
-                <w:b w:val="false"/>
-                <w:bCs w:val="false"/>
-                <w:sz w:val="17"/>
-                <w:szCs w:val="17"/>
+              <w:spacing w:after="20"/>
+            </w:pPr>
+            <w:r>
+              <w:rPr>
+                <w:b w:val="false"/>
+                <w:bCs w:val="false"/>
+                <w:sz w:val="21"/>
+                <w:szCs w:val="21"/>
               </w:rPr>
               <w:t xml:space="preserve">親和（グローバル：長期留学必修）、神戸学院附属（特進グローバル）、神戸龍谷（国際教養）</w:t>
             </w:r>
@@ -5769,14 +5757,14 @@
           </w:tcPr>
           <w:p>
             <w:pPr>
-              <w:spacing w:after="20" w:line="260"/>
-            </w:pPr>
-            <w:r>
-              <w:rPr>
-                <w:b w:val="false"/>
-                <w:bCs w:val="false"/>
-                <w:sz w:val="17"/>
-                <w:szCs w:val="17"/>
+              <w:spacing w:after="20"/>
+            </w:pPr>
+            <w:r>
+              <w:rPr>
+                <w:b w:val="false"/>
+                <w:bCs w:val="false"/>
+                <w:sz w:val="21"/>
+                <w:szCs w:val="21"/>
               </w:rPr>
               <w:t xml:space="preserve">先生・保育士になりたい</w:t>
             </w:r>
@@ -5800,14 +5788,14 @@
           </w:tcPr>
           <w:p>
             <w:pPr>
-              <w:spacing w:after="20" w:line="260"/>
-            </w:pPr>
-            <w:r>
-              <w:rPr>
-                <w:b w:val="false"/>
-                <w:bCs w:val="false"/>
-                <w:sz w:val="17"/>
-                <w:szCs w:val="17"/>
+              <w:spacing w:after="20"/>
+            </w:pPr>
+            <w:r>
+              <w:rPr>
+                <w:b w:val="false"/>
+                <w:bCs w:val="false"/>
+                <w:sz w:val="21"/>
+                <w:szCs w:val="21"/>
               </w:rPr>
               <w:t xml:space="preserve">親和（神戸親和大学の教育系との接続）、武庫川女子附属</w:t>
             </w:r>
@@ -5837,14 +5825,14 @@
           </w:tcPr>
           <w:p>
             <w:pPr>
-              <w:spacing w:after="20" w:line="260"/>
-            </w:pPr>
-            <w:r>
-              <w:rPr>
-                <w:b w:val="false"/>
-                <w:bCs w:val="false"/>
-                <w:sz w:val="17"/>
-                <w:szCs w:val="17"/>
+              <w:spacing w:after="20"/>
+            </w:pPr>
+            <w:r>
+              <w:rPr>
+                <w:b w:val="false"/>
+                <w:bCs w:val="false"/>
+                <w:sz w:val="21"/>
+                <w:szCs w:val="21"/>
               </w:rPr>
               <w:t xml:space="preserve">部活動もしっかり続けたい</w:t>
             </w:r>
@@ -5868,14 +5856,14 @@
           </w:tcPr>
           <w:p>
             <w:pPr>
-              <w:spacing w:after="20" w:line="260"/>
-            </w:pPr>
-            <w:r>
-              <w:rPr>
-                <w:b w:val="false"/>
-                <w:bCs w:val="false"/>
-                <w:sz w:val="17"/>
-                <w:szCs w:val="17"/>
+              <w:spacing w:after="20"/>
+            </w:pPr>
+            <w:r>
+              <w:rPr>
+                <w:b w:val="false"/>
+                <w:bCs w:val="false"/>
+                <w:sz w:val="21"/>
+                <w:szCs w:val="21"/>
               </w:rPr>
               <w:t xml:space="preserve">神戸学院附属・神戸龍谷の総合進学、親和のスポーツ・カルチャー、武庫川女子附属</w:t>
             </w:r>
@@ -5905,14 +5893,14 @@
           </w:tcPr>
           <w:p>
             <w:pPr>
-              <w:spacing w:after="20" w:line="260"/>
-            </w:pPr>
-            <w:r>
-              <w:rPr>
-                <w:b w:val="false"/>
-                <w:bCs w:val="false"/>
-                <w:sz w:val="17"/>
-                <w:szCs w:val="17"/>
+              <w:spacing w:after="20"/>
+            </w:pPr>
+            <w:r>
+              <w:rPr>
+                <w:b w:val="false"/>
+                <w:bCs w:val="false"/>
+                <w:sz w:val="21"/>
+                <w:szCs w:val="21"/>
               </w:rPr>
               <w:t xml:space="preserve">とにかく通学を楽にしたい</w:t>
             </w:r>
@@ -5936,14 +5924,14 @@
           </w:tcPr>
           <w:p>
             <w:pPr>
-              <w:spacing w:after="20" w:line="260"/>
-            </w:pPr>
-            <w:r>
-              <w:rPr>
-                <w:b w:val="false"/>
-                <w:bCs w:val="false"/>
-                <w:sz w:val="17"/>
-                <w:szCs w:val="17"/>
+              <w:spacing w:after="20"/>
+            </w:pPr>
+            <w:r>
+              <w:rPr>
+                <w:b w:val="false"/>
+                <w:bCs w:val="false"/>
+                <w:sz w:val="21"/>
+                <w:szCs w:val="21"/>
               </w:rPr>
               <w:t xml:space="preserve">神戸学院附属（駅から徒歩1分）</w:t>
             </w:r>
@@ -5971,12 +5959,12 @@
           <w:ilvl w:val="0"/>
           <w:numId w:val="3"/>
         </w:numPr>
-        <w:spacing w:after="60" w:line="290"/>
+        <w:spacing w:after="60"/>
       </w:pPr>
       <w:r>
         <w:rPr>
-          <w:sz w:val="20"/>
-          <w:szCs w:val="20"/>
+          <w:sz w:val="21"/>
+          <w:szCs w:val="21"/>
         </w:rPr>
         <w:t xml:space="preserve">通学ルートを実際に試す（朝の時間帯・乗換え・坂道・定期代）。毎日3年間通う道です</w:t>
       </w:r>
@@ -5988,12 +5976,12 @@
           <w:ilvl w:val="0"/>
           <w:numId w:val="3"/>
         </w:numPr>
-        <w:spacing w:after="60" w:line="290"/>
+        <w:spacing w:after="60"/>
       </w:pPr>
       <w:r>
         <w:rPr>
-          <w:sz w:val="20"/>
-          <w:szCs w:val="20"/>
+          <w:sz w:val="21"/>
+          <w:szCs w:val="21"/>
         </w:rPr>
         <w:t xml:space="preserve">女子校か共学か：本人が「どちらの雰囲気で頑張れるか」を見学で確かめる</w:t>
       </w:r>
@@ -6005,12 +5993,12 @@
           <w:ilvl w:val="0"/>
           <w:numId w:val="3"/>
         </w:numPr>
-        <w:spacing w:after="60" w:line="290"/>
+        <w:spacing w:after="60"/>
       </w:pPr>
       <w:r>
         <w:rPr>
-          <w:sz w:val="20"/>
-          <w:szCs w:val="20"/>
+          <w:sz w:val="21"/>
+          <w:szCs w:val="21"/>
         </w:rPr>
         <w:t xml:space="preserve">「特進」と「総合進学」の違い：授業時間数（7時間目・土曜授業）、補習、部活動の制限</w:t>
       </w:r>
@@ -6022,12 +6010,12 @@
           <w:ilvl w:val="0"/>
           <w:numId w:val="3"/>
         </w:numPr>
-        <w:spacing w:after="60" w:line="290"/>
+        <w:spacing w:after="60"/>
       </w:pPr>
       <w:r>
         <w:rPr>
-          <w:sz w:val="20"/>
-          <w:szCs w:val="20"/>
+          <w:sz w:val="21"/>
+          <w:szCs w:val="21"/>
         </w:rPr>
         <w:t xml:space="preserve">大学附属の内部推薦：推薦の条件（評定・人数枠）、外部受験と併用できるか</w:t>
       </w:r>
@@ -6039,12 +6027,12 @@
           <w:ilvl w:val="0"/>
           <w:numId w:val="3"/>
         </w:numPr>
-        <w:spacing w:after="60" w:line="290"/>
+        <w:spacing w:after="60"/>
       </w:pPr>
       <w:r>
         <w:rPr>
-          <w:sz w:val="20"/>
-          <w:szCs w:val="20"/>
+          <w:sz w:val="21"/>
+          <w:szCs w:val="21"/>
         </w:rPr>
         <w:t xml:space="preserve">専願・併願の条件：内申基準、加点制度（英検・漢検など）、併願で公立を受ける場合の扱い</w:t>
       </w:r>
@@ -6056,12 +6044,12 @@
           <w:ilvl w:val="0"/>
           <w:numId w:val="3"/>
         </w:numPr>
-        <w:spacing w:after="60" w:line="290"/>
+        <w:spacing w:after="60"/>
       </w:pPr>
       <w:r>
         <w:rPr>
-          <w:sz w:val="20"/>
-          <w:szCs w:val="20"/>
+          <w:sz w:val="21"/>
+          <w:szCs w:val="21"/>
         </w:rPr>
         <w:t xml:space="preserve">学費：授業料（兵庫県・国の就学支援金で実質負担がどれだけ減るか）、制服・タブレット・修学旅行・留学費用</w:t>
       </w:r>
@@ -6073,12 +6061,12 @@
           <w:ilvl w:val="0"/>
           <w:numId w:val="3"/>
         </w:numPr>
-        <w:spacing w:after="60" w:line="290"/>
+        <w:spacing w:after="60"/>
       </w:pPr>
       <w:r>
         <w:rPr>
-          <w:sz w:val="20"/>
-          <w:szCs w:val="20"/>
+          <w:sz w:val="21"/>
+          <w:szCs w:val="21"/>
         </w:rPr>
         <w:t xml:space="preserve">在校生の様子：説明会・オープンスクール・文化祭で生徒の表情や雰囲気を見る</w:t>
       </w:r>
@@ -6135,15 +6123,15 @@
           </w:tcPr>
           <w:p>
             <w:pPr>
-              <w:spacing w:after="20" w:line="260"/>
+              <w:spacing w:after="20"/>
             </w:pPr>
             <w:r>
               <w:rPr>
                 <w:b/>
                 <w:bCs/>
                 <w:color w:val="FFFFFF"/>
-                <w:sz w:val="17"/>
-                <w:szCs w:val="17"/>
+                <w:sz w:val="21"/>
+                <w:szCs w:val="21"/>
               </w:rPr>
               <w:t xml:space="preserve">時期</w:t>
             </w:r>
@@ -6168,15 +6156,15 @@
           </w:tcPr>
           <w:p>
             <w:pPr>
-              <w:spacing w:after="20" w:line="260"/>
+              <w:spacing w:after="20"/>
             </w:pPr>
             <w:r>
               <w:rPr>
                 <w:b/>
                 <w:bCs/>
                 <w:color w:val="FFFFFF"/>
-                <w:sz w:val="17"/>
-                <w:szCs w:val="17"/>
+                <w:sz w:val="21"/>
+                <w:szCs w:val="21"/>
               </w:rPr>
               <w:t xml:space="preserve">やること</w:t>
             </w:r>
@@ -6206,14 +6194,14 @@
           </w:tcPr>
           <w:p>
             <w:pPr>
-              <w:spacing w:after="20" w:line="260"/>
-            </w:pPr>
-            <w:r>
-              <w:rPr>
-                <w:b w:val="false"/>
-                <w:bCs w:val="false"/>
-                <w:sz w:val="17"/>
-                <w:szCs w:val="17"/>
+              <w:spacing w:after="20"/>
+            </w:pPr>
+            <w:r>
+              <w:rPr>
+                <w:b w:val="false"/>
+                <w:bCs w:val="false"/>
+                <w:sz w:val="21"/>
+                <w:szCs w:val="21"/>
               </w:rPr>
               <w:t xml:space="preserve">中2 秋〜冬</w:t>
             </w:r>
@@ -6237,14 +6225,14 @@
           </w:tcPr>
           <w:p>
             <w:pPr>
-              <w:spacing w:after="20" w:line="260"/>
-            </w:pPr>
-            <w:r>
-              <w:rPr>
-                <w:b w:val="false"/>
-                <w:bCs w:val="false"/>
-                <w:sz w:val="17"/>
-                <w:szCs w:val="17"/>
+              <w:spacing w:after="20"/>
+            </w:pPr>
+            <w:r>
+              <w:rPr>
+                <w:b w:val="false"/>
+                <w:bCs w:val="false"/>
+                <w:sz w:val="21"/>
+                <w:szCs w:val="21"/>
               </w:rPr>
               <w:t xml:space="preserve">各校の文化祭・オープンスクールに参加して雰囲気を比較。候補を2〜3校に絞る</w:t>
             </w:r>
@@ -6274,14 +6262,14 @@
           </w:tcPr>
           <w:p>
             <w:pPr>
-              <w:spacing w:after="20" w:line="260"/>
-            </w:pPr>
-            <w:r>
-              <w:rPr>
-                <w:b w:val="false"/>
-                <w:bCs w:val="false"/>
-                <w:sz w:val="17"/>
-                <w:szCs w:val="17"/>
+              <w:spacing w:after="20"/>
+            </w:pPr>
+            <w:r>
+              <w:rPr>
+                <w:b w:val="false"/>
+                <w:bCs w:val="false"/>
+                <w:sz w:val="21"/>
+                <w:szCs w:val="21"/>
               </w:rPr>
               <w:t xml:space="preserve">中2 3月〜中3 春</w:t>
             </w:r>
@@ -6305,14 +6293,14 @@
           </w:tcPr>
           <w:p>
             <w:pPr>
-              <w:spacing w:after="20" w:line="260"/>
-            </w:pPr>
-            <w:r>
-              <w:rPr>
-                <w:b w:val="false"/>
-                <w:bCs w:val="false"/>
-                <w:sz w:val="17"/>
-                <w:szCs w:val="17"/>
+              <w:spacing w:after="20"/>
+            </w:pPr>
+            <w:r>
+              <w:rPr>
+                <w:b w:val="false"/>
+                <w:bCs w:val="false"/>
+                <w:sz w:val="21"/>
+                <w:szCs w:val="21"/>
               </w:rPr>
               <w:t xml:space="preserve">定期テスト・内申点の土台作り。英検など資格取得（加点・優遇の対象になる場合あり）</w:t>
             </w:r>
@@ -6342,14 +6330,14 @@
           </w:tcPr>
           <w:p>
             <w:pPr>
-              <w:spacing w:after="20" w:line="260"/>
-            </w:pPr>
-            <w:r>
-              <w:rPr>
-                <w:b w:val="false"/>
-                <w:bCs w:val="false"/>
-                <w:sz w:val="17"/>
-                <w:szCs w:val="17"/>
+              <w:spacing w:after="20"/>
+            </w:pPr>
+            <w:r>
+              <w:rPr>
+                <w:b w:val="false"/>
+                <w:bCs w:val="false"/>
+                <w:sz w:val="21"/>
+                <w:szCs w:val="21"/>
               </w:rPr>
               <w:t xml:space="preserve">中3 夏</w:t>
             </w:r>
@@ -6373,14 +6361,14 @@
           </w:tcPr>
           <w:p>
             <w:pPr>
-              <w:spacing w:after="20" w:line="260"/>
-            </w:pPr>
-            <w:r>
-              <w:rPr>
-                <w:b w:val="false"/>
-                <w:bCs w:val="false"/>
-                <w:sz w:val="17"/>
-                <w:szCs w:val="17"/>
+              <w:spacing w:after="20"/>
+            </w:pPr>
+            <w:r>
+              <w:rPr>
+                <w:b w:val="false"/>
+                <w:bCs w:val="false"/>
+                <w:sz w:val="21"/>
+                <w:szCs w:val="21"/>
               </w:rPr>
               <w:t xml:space="preserve">説明会・個別相談会。コースごとの内申基準を確認</w:t>
             </w:r>
@@ -6410,14 +6398,14 @@
           </w:tcPr>
           <w:p>
             <w:pPr>
-              <w:spacing w:after="20" w:line="260"/>
-            </w:pPr>
-            <w:r>
-              <w:rPr>
-                <w:b w:val="false"/>
-                <w:bCs w:val="false"/>
-                <w:sz w:val="17"/>
-                <w:szCs w:val="17"/>
+              <w:spacing w:after="20"/>
+            </w:pPr>
+            <w:r>
+              <w:rPr>
+                <w:b w:val="false"/>
+                <w:bCs w:val="false"/>
+                <w:sz w:val="21"/>
+                <w:szCs w:val="21"/>
               </w:rPr>
               <w:t xml:space="preserve">中3 秋〜冬</w:t>
             </w:r>
@@ -6441,14 +6429,14 @@
           </w:tcPr>
           <w:p>
             <w:pPr>
-              <w:spacing w:after="20" w:line="260"/>
-            </w:pPr>
-            <w:r>
-              <w:rPr>
-                <w:b w:val="false"/>
-                <w:bCs w:val="false"/>
-                <w:sz w:val="17"/>
-                <w:szCs w:val="17"/>
+              <w:spacing w:after="20"/>
+            </w:pPr>
+            <w:r>
+              <w:rPr>
+                <w:b w:val="false"/>
+                <w:bCs w:val="false"/>
+                <w:sz w:val="21"/>
+                <w:szCs w:val="21"/>
               </w:rPr>
               <w:t xml:space="preserve">模試結果と内申をもとに専願／併願・コースを決定</w:t>
             </w:r>
@@ -6478,14 +6466,14 @@
           </w:tcPr>
           <w:p>
             <w:pPr>
-              <w:spacing w:after="20" w:line="260"/>
-            </w:pPr>
-            <w:r>
-              <w:rPr>
-                <w:b w:val="false"/>
-                <w:bCs w:val="false"/>
-                <w:sz w:val="17"/>
-                <w:szCs w:val="17"/>
+              <w:spacing w:after="20"/>
+            </w:pPr>
+            <w:r>
+              <w:rPr>
+                <w:b w:val="false"/>
+                <w:bCs w:val="false"/>
+                <w:sz w:val="21"/>
+                <w:szCs w:val="21"/>
               </w:rPr>
               <w:t xml:space="preserve">中3 2月</w:t>
             </w:r>
@@ -6509,14 +6497,14 @@
           </w:tcPr>
           <w:p>
             <w:pPr>
-              <w:spacing w:after="20" w:line="260"/>
-            </w:pPr>
-            <w:r>
-              <w:rPr>
-                <w:b w:val="false"/>
-                <w:bCs w:val="false"/>
-                <w:sz w:val="17"/>
-                <w:szCs w:val="17"/>
+              <w:spacing w:after="20"/>
+            </w:pPr>
+            <w:r>
+              <w:rPr>
+                <w:b w:val="false"/>
+                <w:bCs w:val="false"/>
+                <w:sz w:val="21"/>
+                <w:szCs w:val="21"/>
               </w:rPr>
               <w:t xml:space="preserve">私立高校入試（兵庫県は例年2月上旬）</w:t>
             </w:r>
@@ -6531,13 +6519,13 @@
     </w:p>
     <w:p>
       <w:pPr>
-        <w:spacing w:after="80" w:line="300"/>
+        <w:spacing w:after="80"/>
       </w:pPr>
       <w:r>
         <w:rPr>
           <w:color w:val="666666"/>
-          <w:sz w:val="17"/>
-          <w:szCs w:val="17"/>
+          <w:sz w:val="21"/>
+          <w:szCs w:val="21"/>
         </w:rPr>
         <w:t xml:space="preserve">【ご注意】本資料は2026年10月時点で公開されている学校案内・入試情報サイト等をもとに作成したものです。コース名・募集人数・行事・アクセス等は年度により変更される場合があります。とくに武庫川女子大学附属は2027年4月に校名変更予定、神戸学院附属はコース名称の表記が情報源により異なります。出願前には必ず各校の公式サイト・最新の募集要項でご確認ください。</w:t>
       </w:r>
@@ -6603,8 +6591,8 @@
     <w:r>
       <w:rPr>
         <w:color w:val="888888"/>
-        <w:sz w:val="16"/>
-        <w:szCs w:val="16"/>
+        <w:sz w:val="21"/>
+        <w:szCs w:val="21"/>
       </w:rPr>
       <w:fldChar w:fldCharType="begin"/>
       <w:instrText xml:space="preserve">PAGE</w:instrText>
@@ -6788,9 +6776,9 @@
   <w:docDefaults>
     <w:rPrDefault>
       <w:rPr>
-        <w:rFonts w:ascii="Meiryo" w:eastAsia="Meiryo" w:hAnsi="Meiryo"/>
-        <w:sz w:val="20"/>
-        <w:szCs w:val="20"/>
+        <w:rFonts w:ascii="ＭＳ 明朝" w:eastAsia="ＭＳ 明朝" w:hAnsi="ＭＳ 明朝"/>
+        <w:sz w:val="21"/>
+        <w:szCs w:val="21"/>
       </w:rPr>
     </w:rPrDefault>
     <w:pPrDefault/>
@@ -6979,12 +6967,12 @@
       <w:outlineLvl w:val="0"/>
     </w:pPr>
     <w:rPr>
-      <w:rFonts w:ascii="Meiryo" w:eastAsia="Meiryo" w:hAnsi="Meiryo"/>
+      <w:rFonts w:ascii="ＭＳ 明朝" w:eastAsia="ＭＳ 明朝" w:hAnsi="ＭＳ 明朝"/>
       <w:b/>
       <w:bCs/>
       <w:color w:val="1F4E79"/>
-      <w:sz w:val="28"/>
-      <w:szCs w:val="28"/>
+      <w:sz w:val="21"/>
+      <w:szCs w:val="21"/>
     </w:rPr>
   </w:style>
   <w:style w:type="paragraph" w:styleId="Heading2">
@@ -6998,12 +6986,12 @@
       <w:outlineLvl w:val="1"/>
     </w:pPr>
     <w:rPr>
-      <w:rFonts w:ascii="Meiryo" w:eastAsia="Meiryo" w:hAnsi="Meiryo"/>
+      <w:rFonts w:ascii="ＭＳ 明朝" w:eastAsia="ＭＳ 明朝" w:hAnsi="ＭＳ 明朝"/>
       <w:b/>
       <w:bCs/>
       <w:color w:val="FFFFFF"/>
-      <w:sz w:val="26"/>
-      <w:szCs w:val="26"/>
+      <w:sz w:val="21"/>
+      <w:szCs w:val="21"/>
     </w:rPr>
   </w:style>
 </w:styles>

</xml_diff>